<commit_message>
chore: aligned repo to Professor's template
</commit_message>
<xml_diff>
--- a/docs/Documentazione_SAD_2026.docx
+++ b/docs/Documentazione_SAD_2026.docx
@@ -59,14 +59,14 @@
                     </a:ln>
                     <a:extLst>
                       <a:ext uri="{909E8E84-426E-40dd-AFC4-6F175D3DCCD1}">
-                        <a14:hiddenFill xmlns:o="urn:schemas-microsoft-com:office:office" xmlns:v="urn:schemas-microsoft-com:vml" xmlns:w10="urn:schemas-microsoft-com:office:word" xmlns:w="http://schemas.openxmlformats.org/wordprocessingml/2006/main" xmlns:arto="http://schemas.microsoft.com/office/word/2006/arto" xmlns="" xmlns:mo="http://schemas.microsoft.com/office/mac/office/2008/main" xmlns:mv="urn:schemas-microsoft-com:mac:vml" xmlns:a14="http://schemas.microsoft.com/office/drawing/2010/main" xmlns:ask="http://schemas.microsoft.com/office/drawing/2018/sketchyshapes">
+                        <a14:hiddenFill xmlns:ask="http://schemas.microsoft.com/office/drawing/2018/sketchyshapes" xmlns:a14="http://schemas.microsoft.com/office/drawing/2010/main" xmlns:mv="urn:schemas-microsoft-com:mac:vml" xmlns:mo="http://schemas.microsoft.com/office/mac/office/2008/main" xmlns="" xmlns:arto="http://schemas.microsoft.com/office/word/2006/arto" xmlns:w="http://schemas.openxmlformats.org/wordprocessingml/2006/main" xmlns:w10="urn:schemas-microsoft-com:office:word" xmlns:v="urn:schemas-microsoft-com:vml" xmlns:o="urn:schemas-microsoft-com:office:office">
                           <a:solidFill>
                             <a:srgbClr val="FFFFFF"/>
                           </a:solidFill>
                         </a14:hiddenFill>
                       </a:ext>
                       <a:ext uri="{91240B29-F687-4f45-9708-019B960494DF}">
-                        <a14:hiddenLine xmlns:o="urn:schemas-microsoft-com:office:office" xmlns:v="urn:schemas-microsoft-com:vml" xmlns:w10="urn:schemas-microsoft-com:office:word" xmlns:w="http://schemas.openxmlformats.org/wordprocessingml/2006/main" xmlns:arto="http://schemas.microsoft.com/office/word/2006/arto" xmlns="" xmlns:mo="http://schemas.microsoft.com/office/mac/office/2008/main" xmlns:mv="urn:schemas-microsoft-com:mac:vml" xmlns:a14="http://schemas.microsoft.com/office/drawing/2010/main" xmlns:ask="http://schemas.microsoft.com/office/drawing/2018/sketchyshapes" w="9525">
+                        <a14:hiddenLine xmlns:ask="http://schemas.microsoft.com/office/drawing/2018/sketchyshapes" xmlns:a14="http://schemas.microsoft.com/office/drawing/2010/main" xmlns:mv="urn:schemas-microsoft-com:mac:vml" xmlns:mo="http://schemas.microsoft.com/office/mac/office/2008/main" xmlns="" xmlns:arto="http://schemas.microsoft.com/office/word/2006/arto" xmlns:w="http://schemas.openxmlformats.org/wordprocessingml/2006/main" xmlns:w10="urn:schemas-microsoft-com:office:word" xmlns:v="urn:schemas-microsoft-com:vml" xmlns:o="urn:schemas-microsoft-com:office:office" w="9525">
                           <a:solidFill>
                             <a:srgbClr val="000000"/>
                           </a:solidFill>
@@ -634,13 +634,12 @@
           <w:sz w:val="32"/>
           <w:szCs w:val="32"/>
         </w:rPr>
-        <w:lastRenderedPageBreak/>
         <w:t>INDICE</w:t>
       </w:r>
     </w:p>
     <w:p>
       <w:pPr>
-        <w:pStyle w:val="Sommario1"/>
+        <w:pStyle w:val="TOC1"/>
         <w:tabs>
           <w:tab w:val="right" w:leader="dot" w:pos="9622"/>
         </w:tabs>
@@ -667,7 +666,7 @@
       <w:hyperlink w:anchor="_Toc243226337" w:history="1">
         <w:r>
           <w:rPr>
-            <w:rStyle w:val="Collegamentoipertestuale"/>
+            <w:rStyle w:val="Hyperlink"/>
             <w:noProof/>
           </w:rPr>
           <w:t>A1 Visione perimetro e glossario</w:t>
@@ -724,7 +723,7 @@
     </w:p>
     <w:p>
       <w:pPr>
-        <w:pStyle w:val="Sommario2"/>
+        <w:pStyle w:val="TOC2"/>
         <w:tabs>
           <w:tab w:val="right" w:leader="dot" w:pos="9622"/>
         </w:tabs>
@@ -740,7 +739,7 @@
       <w:hyperlink w:anchor="_Toc243226338" w:history="1">
         <w:r>
           <w:rPr>
-            <w:rStyle w:val="Collegamentoipertestuale"/>
+            <w:rStyle w:val="Hyperlink"/>
             <w:noProof/>
           </w:rPr>
           <w:t>Glossario iniziale</w:t>
@@ -797,7 +796,7 @@
     </w:p>
     <w:p>
       <w:pPr>
-        <w:pStyle w:val="Sommario1"/>
+        <w:pStyle w:val="TOC1"/>
         <w:tabs>
           <w:tab w:val="right" w:leader="dot" w:pos="9622"/>
         </w:tabs>
@@ -815,7 +814,7 @@
       <w:hyperlink w:anchor="_Toc243226339" w:history="1">
         <w:r>
           <w:rPr>
-            <w:rStyle w:val="Collegamentoipertestuale"/>
+            <w:rStyle w:val="Hyperlink"/>
             <w:noProof/>
           </w:rPr>
           <w:t>A2 Stakeholder e contesto</w:t>
@@ -872,7 +871,7 @@
     </w:p>
     <w:p>
       <w:pPr>
-        <w:pStyle w:val="Sommario2"/>
+        <w:pStyle w:val="TOC2"/>
         <w:tabs>
           <w:tab w:val="right" w:leader="dot" w:pos="9622"/>
         </w:tabs>
@@ -888,7 +887,7 @@
       <w:hyperlink w:anchor="_Toc243226340" w:history="1">
         <w:r>
           <w:rPr>
-            <w:rStyle w:val="Collegamentoipertestuale"/>
+            <w:rStyle w:val="Hyperlink"/>
             <w:noProof/>
           </w:rPr>
           <w:t>Context Diagram CTX 01</w:t>
@@ -945,7 +944,7 @@
     </w:p>
     <w:p>
       <w:pPr>
-        <w:pStyle w:val="Sommario1"/>
+        <w:pStyle w:val="TOC1"/>
         <w:tabs>
           <w:tab w:val="right" w:leader="dot" w:pos="9622"/>
         </w:tabs>
@@ -963,7 +962,7 @@
       <w:hyperlink w:anchor="_Toc243226341" w:history="1">
         <w:r>
           <w:rPr>
-            <w:rStyle w:val="Collegamentoipertestuale"/>
+            <w:rStyle w:val="Hyperlink"/>
             <w:noProof/>
           </w:rPr>
           <w:t>A3 Processo attuale e processo proposto</w:t>
@@ -1020,7 +1019,7 @@
     </w:p>
     <w:p>
       <w:pPr>
-        <w:pStyle w:val="Sommario2"/>
+        <w:pStyle w:val="TOC2"/>
         <w:tabs>
           <w:tab w:val="right" w:leader="dot" w:pos="9622"/>
         </w:tabs>
@@ -1036,7 +1035,7 @@
       <w:hyperlink w:anchor="_Toc243226342" w:history="1">
         <w:r>
           <w:rPr>
-            <w:rStyle w:val="Collegamentoipertestuale"/>
+            <w:rStyle w:val="Hyperlink"/>
             <w:noProof/>
           </w:rPr>
           <w:t>Processo attuale as is</w:t>
@@ -1093,7 +1092,7 @@
     </w:p>
     <w:p>
       <w:pPr>
-        <w:pStyle w:val="Sommario2"/>
+        <w:pStyle w:val="TOC2"/>
         <w:tabs>
           <w:tab w:val="right" w:leader="dot" w:pos="9622"/>
         </w:tabs>
@@ -1109,7 +1108,7 @@
       <w:hyperlink w:anchor="_Toc243226343" w:history="1">
         <w:r>
           <w:rPr>
-            <w:rStyle w:val="Collegamentoipertestuale"/>
+            <w:rStyle w:val="Hyperlink"/>
             <w:noProof/>
           </w:rPr>
           <w:t>Criticità da rappresentare</w:t>
@@ -1166,7 +1165,7 @@
     </w:p>
     <w:p>
       <w:pPr>
-        <w:pStyle w:val="Sommario2"/>
+        <w:pStyle w:val="TOC2"/>
         <w:tabs>
           <w:tab w:val="right" w:leader="dot" w:pos="9622"/>
         </w:tabs>
@@ -1182,7 +1181,7 @@
       <w:hyperlink w:anchor="_Toc243226344" w:history="1">
         <w:r>
           <w:rPr>
-            <w:rStyle w:val="Collegamentoipertestuale"/>
+            <w:rStyle w:val="Hyperlink"/>
             <w:noProof/>
           </w:rPr>
           <w:t>Processo migliorato to be</w:t>
@@ -1239,7 +1238,7 @@
     </w:p>
     <w:p>
       <w:pPr>
-        <w:pStyle w:val="Sommario2"/>
+        <w:pStyle w:val="TOC2"/>
         <w:tabs>
           <w:tab w:val="right" w:leader="dot" w:pos="9622"/>
         </w:tabs>
@@ -1255,7 +1254,7 @@
       <w:hyperlink w:anchor="_Toc243226345" w:history="1">
         <w:r>
           <w:rPr>
-            <w:rStyle w:val="Collegamentoipertestuale"/>
+            <w:rStyle w:val="Hyperlink"/>
             <w:noProof/>
           </w:rPr>
           <w:t>Scheda di un miglioramento</w:t>
@@ -1312,7 +1311,7 @@
     </w:p>
     <w:p>
       <w:pPr>
-        <w:pStyle w:val="Sommario2"/>
+        <w:pStyle w:val="TOC2"/>
         <w:tabs>
           <w:tab w:val="right" w:leader="dot" w:pos="9622"/>
         </w:tabs>
@@ -1328,7 +1327,7 @@
       <w:hyperlink w:anchor="_Toc243226346" w:history="1">
         <w:r>
           <w:rPr>
-            <w:rStyle w:val="Collegamentoipertestuale"/>
+            <w:rStyle w:val="Hyperlink"/>
             <w:noProof/>
           </w:rPr>
           <w:t>Ciclo di vita delle richieste</w:t>
@@ -1385,7 +1384,7 @@
     </w:p>
     <w:p>
       <w:pPr>
-        <w:pStyle w:val="Sommario1"/>
+        <w:pStyle w:val="TOC1"/>
         <w:tabs>
           <w:tab w:val="right" w:leader="dot" w:pos="9622"/>
         </w:tabs>
@@ -1403,7 +1402,7 @@
       <w:hyperlink w:anchor="_Toc243226347" w:history="1">
         <w:r>
           <w:rPr>
-            <w:rStyle w:val="Collegamentoipertestuale"/>
+            <w:rStyle w:val="Hyperlink"/>
             <w:noProof/>
           </w:rPr>
           <w:t>A4 Epic backlog e User Story</w:t>
@@ -1460,7 +1459,7 @@
     </w:p>
     <w:p>
       <w:pPr>
-        <w:pStyle w:val="Sommario2"/>
+        <w:pStyle w:val="TOC2"/>
         <w:tabs>
           <w:tab w:val="right" w:leader="dot" w:pos="9622"/>
         </w:tabs>
@@ -1476,7 +1475,7 @@
       <w:hyperlink w:anchor="_Toc243226348" w:history="1">
         <w:r>
           <w:rPr>
-            <w:rStyle w:val="Collegamentoipertestuale"/>
+            <w:rStyle w:val="Hyperlink"/>
             <w:noProof/>
           </w:rPr>
           <w:t>Registro delle Epic</w:t>
@@ -1533,7 +1532,7 @@
     </w:p>
     <w:p>
       <w:pPr>
-        <w:pStyle w:val="Sommario2"/>
+        <w:pStyle w:val="TOC2"/>
         <w:tabs>
           <w:tab w:val="right" w:leader="dot" w:pos="9622"/>
         </w:tabs>
@@ -1549,7 +1548,7 @@
       <w:hyperlink w:anchor="_Toc243226349" w:history="1">
         <w:r>
           <w:rPr>
-            <w:rStyle w:val="Collegamentoipertestuale"/>
+            <w:rStyle w:val="Hyperlink"/>
             <w:noProof/>
           </w:rPr>
           <w:t>Fotografia del backlog</w:t>
@@ -1606,7 +1605,7 @@
     </w:p>
     <w:p>
       <w:pPr>
-        <w:pStyle w:val="Sommario2"/>
+        <w:pStyle w:val="TOC2"/>
         <w:tabs>
           <w:tab w:val="right" w:leader="dot" w:pos="9622"/>
         </w:tabs>
@@ -1622,7 +1621,7 @@
       <w:hyperlink w:anchor="_Toc243226350" w:history="1">
         <w:r>
           <w:rPr>
-            <w:rStyle w:val="Collegamentoipertestuale"/>
+            <w:rStyle w:val="Hyperlink"/>
             <w:noProof/>
           </w:rPr>
           <w:t>Identificativi stabili</w:t>
@@ -1679,7 +1678,7 @@
     </w:p>
     <w:p>
       <w:pPr>
-        <w:pStyle w:val="Sommario2"/>
+        <w:pStyle w:val="TOC2"/>
         <w:tabs>
           <w:tab w:val="right" w:leader="dot" w:pos="9622"/>
         </w:tabs>
@@ -1695,7 +1694,7 @@
       <w:hyperlink w:anchor="_Toc243226351" w:history="1">
         <w:r>
           <w:rPr>
-            <w:rStyle w:val="Collegamentoipertestuale"/>
+            <w:rStyle w:val="Hyperlink"/>
             <w:noProof/>
           </w:rPr>
           <w:t>Scheda riutilizzabile della User Story</w:t>
@@ -1752,7 +1751,7 @@
     </w:p>
     <w:p>
       <w:pPr>
-        <w:pStyle w:val="Sommario2"/>
+        <w:pStyle w:val="TOC2"/>
         <w:tabs>
           <w:tab w:val="right" w:leader="dot" w:pos="9622"/>
         </w:tabs>
@@ -1768,7 +1767,7 @@
       <w:hyperlink w:anchor="_Toc243226352" w:history="1">
         <w:r>
           <w:rPr>
-            <w:rStyle w:val="Collegamentoipertestuale"/>
+            <w:rStyle w:val="Hyperlink"/>
             <w:noProof/>
           </w:rPr>
           <w:t>Criteri di accettazione</w:t>
@@ -1825,7 +1824,7 @@
     </w:p>
     <w:p>
       <w:pPr>
-        <w:pStyle w:val="Sommario2"/>
+        <w:pStyle w:val="TOC2"/>
         <w:tabs>
           <w:tab w:val="right" w:leader="dot" w:pos="9622"/>
         </w:tabs>
@@ -1841,7 +1840,7 @@
       <w:hyperlink w:anchor="_Toc243226353" w:history="1">
         <w:r>
           <w:rPr>
-            <w:rStyle w:val="Collegamentoipertestuale"/>
+            <w:rStyle w:val="Hyperlink"/>
             <w:noProof/>
           </w:rPr>
           <w:t>Valutazione INVEST</w:t>
@@ -1898,7 +1897,7 @@
     </w:p>
     <w:p>
       <w:pPr>
-        <w:pStyle w:val="Sommario1"/>
+        <w:pStyle w:val="TOC1"/>
         <w:tabs>
           <w:tab w:val="right" w:leader="dot" w:pos="9622"/>
         </w:tabs>
@@ -1916,7 +1915,7 @@
       <w:hyperlink w:anchor="_Toc243226354" w:history="1">
         <w:r>
           <w:rPr>
-            <w:rStyle w:val="Collegamentoipertestuale"/>
+            <w:rStyle w:val="Hyperlink"/>
             <w:noProof/>
           </w:rPr>
           <w:t>A5 Dati e scenari di qualità</w:t>
@@ -1973,7 +1972,7 @@
     </w:p>
     <w:p>
       <w:pPr>
-        <w:pStyle w:val="Sommario2"/>
+        <w:pStyle w:val="TOC2"/>
         <w:tabs>
           <w:tab w:val="right" w:leader="dot" w:pos="9622"/>
         </w:tabs>
@@ -1989,7 +1988,7 @@
       <w:hyperlink w:anchor="_Toc243226355" w:history="1">
         <w:r>
           <w:rPr>
-            <w:rStyle w:val="Collegamentoipertestuale"/>
+            <w:rStyle w:val="Hyperlink"/>
             <w:noProof/>
           </w:rPr>
           <w:t>Requisiti sui dati</w:t>
@@ -2046,7 +2045,7 @@
     </w:p>
     <w:p>
       <w:pPr>
-        <w:pStyle w:val="Sommario2"/>
+        <w:pStyle w:val="TOC2"/>
         <w:tabs>
           <w:tab w:val="right" w:leader="dot" w:pos="9622"/>
         </w:tabs>
@@ -2062,7 +2061,7 @@
       <w:hyperlink w:anchor="_Toc243226356" w:history="1">
         <w:r>
           <w:rPr>
-            <w:rStyle w:val="Collegamentoipertestuale"/>
+            <w:rStyle w:val="Hyperlink"/>
             <w:noProof/>
           </w:rPr>
           <w:t>Protezione e validazione</w:t>
@@ -2119,7 +2118,7 @@
     </w:p>
     <w:p>
       <w:pPr>
-        <w:pStyle w:val="Sommario2"/>
+        <w:pStyle w:val="TOC2"/>
         <w:tabs>
           <w:tab w:val="right" w:leader="dot" w:pos="9622"/>
         </w:tabs>
@@ -2135,7 +2134,7 @@
       <w:hyperlink w:anchor="_Toc243226357" w:history="1">
         <w:r>
           <w:rPr>
-            <w:rStyle w:val="Collegamentoipertestuale"/>
+            <w:rStyle w:val="Hyperlink"/>
             <w:noProof/>
           </w:rPr>
           <w:t>Quality Scenario Catalogue</w:t>
@@ -2192,7 +2191,7 @@
     </w:p>
     <w:p>
       <w:pPr>
-        <w:pStyle w:val="Sommario2"/>
+        <w:pStyle w:val="TOC2"/>
         <w:tabs>
           <w:tab w:val="right" w:leader="dot" w:pos="9622"/>
         </w:tabs>
@@ -2208,7 +2207,7 @@
       <w:hyperlink w:anchor="_Toc243226358" w:history="1">
         <w:r>
           <w:rPr>
-            <w:rStyle w:val="Collegamentoipertestuale"/>
+            <w:rStyle w:val="Hyperlink"/>
             <w:noProof/>
           </w:rPr>
           <w:t>Scheda riutilizzabile dello scenario</w:t>
@@ -2265,7 +2264,7 @@
     </w:p>
     <w:p>
       <w:pPr>
-        <w:pStyle w:val="Sommario1"/>
+        <w:pStyle w:val="TOC1"/>
         <w:tabs>
           <w:tab w:val="right" w:leader="dot" w:pos="9622"/>
         </w:tabs>
@@ -2283,7 +2282,7 @@
       <w:hyperlink w:anchor="_Toc243226359" w:history="1">
         <w:r>
           <w:rPr>
-            <w:rStyle w:val="Collegamentoipertestuale"/>
+            <w:rStyle w:val="Hyperlink"/>
             <w:noProof/>
           </w:rPr>
           <w:t>A6 Domande aperte e ipotesi</w:t>
@@ -2340,7 +2339,7 @@
     </w:p>
     <w:p>
       <w:pPr>
-        <w:pStyle w:val="Sommario2"/>
+        <w:pStyle w:val="TOC2"/>
         <w:tabs>
           <w:tab w:val="right" w:leader="dot" w:pos="9622"/>
         </w:tabs>
@@ -2356,7 +2355,7 @@
       <w:hyperlink w:anchor="_Toc243226360" w:history="1">
         <w:r>
           <w:rPr>
-            <w:rStyle w:val="Collegamentoipertestuale"/>
+            <w:rStyle w:val="Hyperlink"/>
             <w:noProof/>
           </w:rPr>
           <w:t>Scheda riutilizzabile di domanda e ipotesi</w:t>
@@ -2413,7 +2412,7 @@
     </w:p>
     <w:p>
       <w:pPr>
-        <w:pStyle w:val="Sommario2"/>
+        <w:pStyle w:val="TOC2"/>
         <w:tabs>
           <w:tab w:val="right" w:leader="dot" w:pos="9622"/>
         </w:tabs>
@@ -2429,7 +2428,7 @@
       <w:hyperlink w:anchor="_Toc243226361" w:history="1">
         <w:r>
           <w:rPr>
-            <w:rStyle w:val="Collegamentoipertestuale"/>
+            <w:rStyle w:val="Hyperlink"/>
             <w:noProof/>
           </w:rPr>
           <w:t>Gestione del registro</w:t>
@@ -2486,7 +2485,7 @@
     </w:p>
     <w:p>
       <w:pPr>
-        <w:pStyle w:val="Sommario1"/>
+        <w:pStyle w:val="TOC1"/>
         <w:tabs>
           <w:tab w:val="right" w:leader="dot" w:pos="9622"/>
         </w:tabs>
@@ -2504,7 +2503,7 @@
       <w:hyperlink w:anchor="_Toc243226362" w:history="1">
         <w:r>
           <w:rPr>
-            <w:rStyle w:val="Collegamentoipertestuale"/>
+            <w:rStyle w:val="Hyperlink"/>
             <w:noProof/>
           </w:rPr>
           <w:t>A7 Proposta di MVP</w:t>
@@ -2561,7 +2560,7 @@
     </w:p>
     <w:p>
       <w:pPr>
-        <w:pStyle w:val="Sommario2"/>
+        <w:pStyle w:val="TOC2"/>
         <w:tabs>
           <w:tab w:val="right" w:leader="dot" w:pos="9622"/>
         </w:tabs>
@@ -2577,7 +2576,7 @@
       <w:hyperlink w:anchor="_Toc243226363" w:history="1">
         <w:r>
           <w:rPr>
-            <w:rStyle w:val="Collegamentoipertestuale"/>
+            <w:rStyle w:val="Hyperlink"/>
             <w:noProof/>
           </w:rPr>
           <w:t>MVP e primo incremento tecnico</w:t>
@@ -2634,7 +2633,7 @@
     </w:p>
     <w:p>
       <w:pPr>
-        <w:pStyle w:val="Sommario1"/>
+        <w:pStyle w:val="TOC1"/>
         <w:tabs>
           <w:tab w:val="right" w:leader="dot" w:pos="9622"/>
         </w:tabs>
@@ -2652,7 +2651,7 @@
       <w:hyperlink w:anchor="_Toc243226364" w:history="1">
         <w:r>
           <w:rPr>
-            <w:rStyle w:val="Collegamentoipertestuale"/>
+            <w:rStyle w:val="Hyperlink"/>
             <w:noProof/>
           </w:rPr>
           <w:t>A8 Architettura e decisioni tecniche</w:t>
@@ -2709,7 +2708,7 @@
     </w:p>
     <w:p>
       <w:pPr>
-        <w:pStyle w:val="Sommario2"/>
+        <w:pStyle w:val="TOC2"/>
         <w:tabs>
           <w:tab w:val="right" w:leader="dot" w:pos="9622"/>
         </w:tabs>
@@ -2725,7 +2724,7 @@
       <w:hyperlink w:anchor="_Toc243226365" w:history="1">
         <w:r>
           <w:rPr>
-            <w:rStyle w:val="Collegamentoipertestuale"/>
+            <w:rStyle w:val="Hyperlink"/>
             <w:noProof/>
           </w:rPr>
           <w:t>Stack adottato</w:t>
@@ -2782,7 +2781,7 @@
     </w:p>
     <w:p>
       <w:pPr>
-        <w:pStyle w:val="Sommario2"/>
+        <w:pStyle w:val="TOC2"/>
         <w:tabs>
           <w:tab w:val="right" w:leader="dot" w:pos="9622"/>
         </w:tabs>
@@ -2798,7 +2797,7 @@
       <w:hyperlink w:anchor="_Toc243226366" w:history="1">
         <w:r>
           <w:rPr>
-            <w:rStyle w:val="Collegamentoipertestuale"/>
+            <w:rStyle w:val="Hyperlink"/>
             <w:noProof/>
           </w:rPr>
           <w:t>Responsabilità MVC</w:t>
@@ -2855,7 +2854,7 @@
     </w:p>
     <w:p>
       <w:pPr>
-        <w:pStyle w:val="Sommario2"/>
+        <w:pStyle w:val="TOC2"/>
         <w:tabs>
           <w:tab w:val="right" w:leader="dot" w:pos="9622"/>
         </w:tabs>
@@ -2871,7 +2870,7 @@
       <w:hyperlink w:anchor="_Toc243226367" w:history="1">
         <w:r>
           <w:rPr>
-            <w:rStyle w:val="Collegamentoipertestuale"/>
+            <w:rStyle w:val="Hyperlink"/>
             <w:noProof/>
           </w:rPr>
           <w:t>Confini modulari e qualità</w:t>
@@ -2928,7 +2927,7 @@
     </w:p>
     <w:p>
       <w:pPr>
-        <w:pStyle w:val="Sommario2"/>
+        <w:pStyle w:val="TOC2"/>
         <w:tabs>
           <w:tab w:val="right" w:leader="dot" w:pos="9622"/>
         </w:tabs>
@@ -2944,7 +2943,7 @@
       <w:hyperlink w:anchor="_Toc243226368" w:history="1">
         <w:r>
           <w:rPr>
-            <w:rStyle w:val="Collegamentoipertestuale"/>
+            <w:rStyle w:val="Hyperlink"/>
             <w:noProof/>
           </w:rPr>
           <w:t>GRASP e pattern GoF</w:t>
@@ -3001,7 +3000,7 @@
     </w:p>
     <w:p>
       <w:pPr>
-        <w:pStyle w:val="Sommario2"/>
+        <w:pStyle w:val="TOC2"/>
         <w:tabs>
           <w:tab w:val="right" w:leader="dot" w:pos="9622"/>
         </w:tabs>
@@ -3017,7 +3016,7 @@
       <w:hyperlink w:anchor="_Toc243226369" w:history="1">
         <w:r>
           <w:rPr>
-            <w:rStyle w:val="Collegamentoipertestuale"/>
+            <w:rStyle w:val="Hyperlink"/>
             <w:noProof/>
           </w:rPr>
           <w:t>Viste e contratti da introdurre</w:t>
@@ -3074,7 +3073,7 @@
     </w:p>
     <w:p>
       <w:pPr>
-        <w:pStyle w:val="Sommario2"/>
+        <w:pStyle w:val="TOC2"/>
         <w:tabs>
           <w:tab w:val="right" w:leader="dot" w:pos="9622"/>
         </w:tabs>
@@ -3090,7 +3089,7 @@
       <w:hyperlink w:anchor="_Toc243226370" w:history="1">
         <w:r>
           <w:rPr>
-            <w:rStyle w:val="Collegamentoipertestuale"/>
+            <w:rStyle w:val="Hyperlink"/>
             <w:noProof/>
           </w:rPr>
           <w:t>Scheda riutilizzabile di Architecture Decision Record</w:t>
@@ -3147,7 +3146,7 @@
     </w:p>
     <w:p>
       <w:pPr>
-        <w:pStyle w:val="Sommario2"/>
+        <w:pStyle w:val="TOC2"/>
         <w:tabs>
           <w:tab w:val="right" w:leader="dot" w:pos="9622"/>
         </w:tabs>
@@ -3163,7 +3162,7 @@
       <w:hyperlink w:anchor="_Toc243226371" w:history="1">
         <w:r>
           <w:rPr>
-            <w:rStyle w:val="Collegamentoipertestuale"/>
+            <w:rStyle w:val="Hyperlink"/>
             <w:noProof/>
           </w:rPr>
           <w:t>Registro delle decisioni da mantenere</w:t>
@@ -3220,7 +3219,7 @@
     </w:p>
     <w:p>
       <w:pPr>
-        <w:pStyle w:val="Sommario1"/>
+        <w:pStyle w:val="TOC1"/>
         <w:tabs>
           <w:tab w:val="right" w:leader="dot" w:pos="9622"/>
         </w:tabs>
@@ -3238,7 +3237,7 @@
       <w:hyperlink w:anchor="_Toc243226372" w:history="1">
         <w:r>
           <w:rPr>
-            <w:rStyle w:val="Collegamentoipertestuale"/>
+            <w:rStyle w:val="Hyperlink"/>
             <w:noProof/>
           </w:rPr>
           <w:t>A9 Incrementi verifiche ed esecuzione</w:t>
@@ -3295,7 +3294,7 @@
     </w:p>
     <w:p>
       <w:pPr>
-        <w:pStyle w:val="Sommario2"/>
+        <w:pStyle w:val="TOC2"/>
         <w:tabs>
           <w:tab w:val="right" w:leader="dot" w:pos="9622"/>
         </w:tabs>
@@ -3311,7 +3310,7 @@
       <w:hyperlink w:anchor="_Toc243226373" w:history="1">
         <w:r>
           <w:rPr>
-            <w:rStyle w:val="Collegamentoipertestuale"/>
+            <w:rStyle w:val="Hyperlink"/>
             <w:noProof/>
           </w:rPr>
           <w:t>Registro degli incrementi</w:t>
@@ -3368,7 +3367,7 @@
     </w:p>
     <w:p>
       <w:pPr>
-        <w:pStyle w:val="Sommario2"/>
+        <w:pStyle w:val="TOC2"/>
         <w:tabs>
           <w:tab w:val="right" w:leader="dot" w:pos="9622"/>
         </w:tabs>
@@ -3384,7 +3383,7 @@
       <w:hyperlink w:anchor="_Toc243226374" w:history="1">
         <w:r>
           <w:rPr>
-            <w:rStyle w:val="Collegamentoipertestuale"/>
+            <w:rStyle w:val="Hyperlink"/>
             <w:noProof/>
           </w:rPr>
           <w:t>Strategia di verifica adottata</w:t>
@@ -3441,7 +3440,7 @@
     </w:p>
     <w:p>
       <w:pPr>
-        <w:pStyle w:val="Sommario2"/>
+        <w:pStyle w:val="TOC2"/>
         <w:tabs>
           <w:tab w:val="right" w:leader="dot" w:pos="9622"/>
         </w:tabs>
@@ -3457,7 +3456,7 @@
       <w:hyperlink w:anchor="_Toc243226375" w:history="1">
         <w:r>
           <w:rPr>
-            <w:rStyle w:val="Collegamentoipertestuale"/>
+            <w:rStyle w:val="Hyperlink"/>
             <w:noProof/>
           </w:rPr>
           <w:t>Scheda riutilizzabile della verifica</w:t>
@@ -3514,7 +3513,7 @@
     </w:p>
     <w:p>
       <w:pPr>
-        <w:pStyle w:val="Sommario2"/>
+        <w:pStyle w:val="TOC2"/>
         <w:tabs>
           <w:tab w:val="right" w:leader="dot" w:pos="9622"/>
         </w:tabs>
@@ -3530,7 +3529,7 @@
       <w:hyperlink w:anchor="_Toc243226376" w:history="1">
         <w:r>
           <w:rPr>
-            <w:rStyle w:val="Collegamentoipertestuale"/>
+            <w:rStyle w:val="Hyperlink"/>
             <w:noProof/>
           </w:rPr>
           <w:t>Istruzioni riproducibili e deployment</w:t>
@@ -3587,7 +3586,7 @@
     </w:p>
     <w:p>
       <w:pPr>
-        <w:pStyle w:val="Sommario2"/>
+        <w:pStyle w:val="TOC2"/>
         <w:tabs>
           <w:tab w:val="right" w:leader="dot" w:pos="9622"/>
         </w:tabs>
@@ -3603,7 +3602,7 @@
       <w:hyperlink w:anchor="_Toc243226377" w:history="1">
         <w:r>
           <w:rPr>
-            <w:rStyle w:val="Collegamentoipertestuale"/>
+            <w:rStyle w:val="Hyperlink"/>
             <w:noProof/>
           </w:rPr>
           <w:t>Coerenza tra prodotto e documentazione</w:t>
@@ -3668,7 +3667,7 @@
     </w:p>
     <w:p>
       <w:pPr>
-        <w:pStyle w:val="Sommario1"/>
+        <w:pStyle w:val="TOC1"/>
         <w:tabs>
           <w:tab w:val="right" w:leader="dot" w:pos="9622"/>
         </w:tabs>
@@ -3695,7 +3694,7 @@
       <w:hyperlink w:anchor="_Toc243226378" w:history="1">
         <w:r>
           <w:rPr>
-            <w:rStyle w:val="Collegamentoipertestuale"/>
+            <w:rStyle w:val="Hyperlink"/>
             <w:noProof/>
           </w:rPr>
           <w:t>B1 Team e collaborazione</w:t>
@@ -3752,7 +3751,7 @@
     </w:p>
     <w:p>
       <w:pPr>
-        <w:pStyle w:val="Sommario1"/>
+        <w:pStyle w:val="TOC1"/>
         <w:tabs>
           <w:tab w:val="right" w:leader="dot" w:pos="9622"/>
         </w:tabs>
@@ -3770,7 +3769,7 @@
       <w:hyperlink w:anchor="_Toc243226379" w:history="1">
         <w:r>
           <w:rPr>
-            <w:rStyle w:val="Collegamentoipertestuale"/>
+            <w:rStyle w:val="Hyperlink"/>
             <w:noProof/>
           </w:rPr>
           <w:t>B2 Calendario e criteri di completamento</w:t>
@@ -3827,7 +3826,7 @@
     </w:p>
     <w:p>
       <w:pPr>
-        <w:pStyle w:val="Sommario1"/>
+        <w:pStyle w:val="TOC1"/>
         <w:tabs>
           <w:tab w:val="right" w:leader="dot" w:pos="9622"/>
         </w:tabs>
@@ -3845,7 +3844,7 @@
       <w:hyperlink w:anchor="_Toc243226380" w:history="1">
         <w:r>
           <w:rPr>
-            <w:rStyle w:val="Collegamentoipertestuale"/>
+            <w:rStyle w:val="Hyperlink"/>
             <w:noProof/>
           </w:rPr>
           <w:t>C1 Registro della preparazione</w:t>
@@ -3902,7 +3901,7 @@
     </w:p>
     <w:p>
       <w:pPr>
-        <w:pStyle w:val="Sommario1"/>
+        <w:pStyle w:val="TOC1"/>
         <w:tabs>
           <w:tab w:val="right" w:leader="dot" w:pos="9622"/>
         </w:tabs>
@@ -3920,7 +3919,7 @@
       <w:hyperlink w:anchor="_Toc243226381" w:history="1">
         <w:r>
           <w:rPr>
-            <w:rStyle w:val="Collegamentoipertestuale"/>
+            <w:rStyle w:val="Hyperlink"/>
             <w:noProof/>
           </w:rPr>
           <w:t>C2 Registro della costruzione 1</w:t>
@@ -3977,7 +3976,7 @@
     </w:p>
     <w:p>
       <w:pPr>
-        <w:pStyle w:val="Sommario1"/>
+        <w:pStyle w:val="TOC1"/>
         <w:tabs>
           <w:tab w:val="right" w:leader="dot" w:pos="9622"/>
         </w:tabs>
@@ -3995,7 +3994,7 @@
       <w:hyperlink w:anchor="_Toc243226382" w:history="1">
         <w:r>
           <w:rPr>
-            <w:rStyle w:val="Collegamentoipertestuale"/>
+            <w:rStyle w:val="Hyperlink"/>
             <w:noProof/>
           </w:rPr>
           <w:t>C3 Registro della costruzione 2</w:t>
@@ -4052,7 +4051,7 @@
     </w:p>
     <w:p>
       <w:pPr>
-        <w:pStyle w:val="Sommario1"/>
+        <w:pStyle w:val="TOC1"/>
         <w:tabs>
           <w:tab w:val="right" w:leader="dot" w:pos="9622"/>
         </w:tabs>
@@ -4070,7 +4069,7 @@
       <w:hyperlink w:anchor="_Toc243226383" w:history="1">
         <w:r>
           <w:rPr>
-            <w:rStyle w:val="Collegamentoipertestuale"/>
+            <w:rStyle w:val="Hyperlink"/>
             <w:noProof/>
           </w:rPr>
           <w:t>C4 Registro della costruzione 3</w:t>
@@ -4127,7 +4126,7 @@
     </w:p>
     <w:p>
       <w:pPr>
-        <w:pStyle w:val="Sommario1"/>
+        <w:pStyle w:val="TOC1"/>
         <w:tabs>
           <w:tab w:val="right" w:leader="dot" w:pos="9622"/>
         </w:tabs>
@@ -4145,7 +4144,7 @@
       <w:hyperlink w:anchor="_Toc243226384" w:history="1">
         <w:r>
           <w:rPr>
-            <w:rStyle w:val="Collegamentoipertestuale"/>
+            <w:rStyle w:val="Hyperlink"/>
             <w:noProof/>
           </w:rPr>
           <w:t>D1 Tracciabilità e diagrammi</w:t>
@@ -4202,7 +4201,7 @@
     </w:p>
     <w:p>
       <w:pPr>
-        <w:pStyle w:val="Sommario1"/>
+        <w:pStyle w:val="TOC1"/>
         <w:tabs>
           <w:tab w:val="right" w:leader="dot" w:pos="9622"/>
         </w:tabs>
@@ -4220,7 +4219,7 @@
       <w:hyperlink w:anchor="_Toc243226385" w:history="1">
         <w:r>
           <w:rPr>
-            <w:rStyle w:val="Collegamentoipertestuale"/>
+            <w:rStyle w:val="Hyperlink"/>
             <w:noProof/>
           </w:rPr>
           <w:t>D2 Fonti e riferimenti</w:t>
@@ -4308,7 +4307,6 @@
           <w:sz w:val="32"/>
           <w:szCs w:val="32"/>
         </w:rPr>
-        <w:lastRenderedPageBreak/>
         <w:t>USO DEL DOCUMENTO</w:t>
       </w:r>
     </w:p>
@@ -4324,7 +4322,7 @@
     </w:p>
     <w:p>
       <w:pPr>
-        <w:pStyle w:val="Titolo2"/>
+        <w:pStyle w:val="Heading2"/>
       </w:pPr>
       <w:r>
         <w:t>Stato delle informazioni</w:t>
@@ -4332,7 +4330,7 @@
     </w:p>
     <w:tbl>
       <w:tblPr>
-        <w:tblStyle w:val="Grigliatabella"/>
+        <w:tblStyle w:val="TableGrid"/>
         <w:tblW w:w="0" w:type="auto"/>
         <w:jc w:val="center"/>
         <w:tblBorders>
@@ -4644,7 +4642,7 @@
     </w:p>
     <w:p>
       <w:pPr>
-        <w:pStyle w:val="Titolo2"/>
+        <w:pStyle w:val="Heading2"/>
       </w:pPr>
       <w:r>
         <w:t>Registro delle modifiche</w:t>
@@ -4652,7 +4650,7 @@
     </w:p>
     <w:tbl>
       <w:tblPr>
-        <w:tblStyle w:val="Grigliatabella"/>
+        <w:tblStyle w:val="TableGrid"/>
         <w:tblW w:w="0" w:type="auto"/>
         <w:jc w:val="center"/>
         <w:tblBorders>
@@ -4832,12 +4830,27 @@
             <w:pPr>
               <w:spacing w:after="20"/>
               <w:jc w:val="left"/>
-            </w:pPr>
-            <w:r>
-              <w:rPr>
-                <w:sz w:val="22"/>
-              </w:rPr>
-              <w:t>Versione successiva</w:t>
+              <w:rPr>
+                <w:sz w:val="22"/>
+              </w:rPr>
+            </w:pPr>
+            <w:r>
+              <w:rPr>
+                <w:sz w:val="22"/>
+              </w:rPr>
+              <w:t>0.3</w:t>
+            </w:r>
+          </w:p>
+          <w:p>
+            <w:pPr>
+              <w:spacing w:after="20"/>
+              <w:jc w:val="left"/>
+            </w:pPr>
+            <w:r>
+              <w:rPr>
+                <w:sz w:val="22"/>
+              </w:rPr>
+              <w:t>21/10/2026</w:t>
             </w:r>
           </w:p>
         </w:tc>
@@ -4877,6 +4890,60 @@
               </w:rPr>
               <w:t>Issue e artefatti coinvolti</w:t>
             </w:r>
+          </w:p>
+        </w:tc>
+      </w:tr>
+      <w:tr>
+        <w:trPr>
+          <w:cantSplit/>
+          <w:jc w:val="center"/>
+        </w:trPr>
+        <w:tc>
+          <w:tcPr>
+            <w:tcW w:w="1757" w:type="dxa"/>
+            <w:shd w:val="clear" w:color="auto" w:fill="FFFFFF"/>
+            <w:vAlign w:val="center"/>
+          </w:tcPr>
+          <w:p>
+            <w:pPr>
+              <w:spacing w:after="20"/>
+              <w:jc w:val="left"/>
+              <w:rPr>
+                <w:sz w:val="22"/>
+              </w:rPr>
+            </w:pPr>
+          </w:p>
+        </w:tc>
+        <w:tc>
+          <w:tcPr>
+            <w:tcW w:w="5329" w:type="dxa"/>
+            <w:shd w:val="clear" w:color="auto" w:fill="FFFFFF"/>
+            <w:vAlign w:val="center"/>
+          </w:tcPr>
+          <w:p>
+            <w:pPr>
+              <w:spacing w:after="20"/>
+              <w:jc w:val="left"/>
+              <w:rPr>
+                <w:sz w:val="22"/>
+              </w:rPr>
+            </w:pPr>
+          </w:p>
+        </w:tc>
+        <w:tc>
+          <w:tcPr>
+            <w:tcW w:w="2494" w:type="dxa"/>
+            <w:shd w:val="clear" w:color="auto" w:fill="FFFFFF"/>
+            <w:vAlign w:val="center"/>
+          </w:tcPr>
+          <w:p>
+            <w:pPr>
+              <w:spacing w:after="20"/>
+              <w:jc w:val="left"/>
+              <w:rPr>
+                <w:sz w:val="22"/>
+              </w:rPr>
+            </w:pPr>
           </w:p>
         </w:tc>
       </w:tr>
@@ -4910,13 +4977,12 @@
     </w:p>
     <w:p>
       <w:pPr>
-        <w:pStyle w:val="Titolo1"/>
+        <w:pStyle w:val="Heading1"/>
       </w:pPr>
       <w:bookmarkStart w:id="0" w:name="_Toc243225284"/>
       <w:bookmarkStart w:id="1" w:name="_Toc243226337"/>
       <w:bookmarkStart w:id="2" w:name="PicusProduct"/>
       <w:r>
-        <w:lastRenderedPageBreak/>
         <w:t>A1 Visione perimetro e glossario</w:t>
       </w:r>
       <w:bookmarkEnd w:id="0"/>
@@ -4924,7 +4990,25 @@
     </w:p>
     <w:p>
       <w:r>
-        <w:t>PICUS supporta il Banco nel coordinamento delle Organizzazioni Partner Territoriali, delle misure di accompagnamento e degli erogatori. Il contesto regionale comprende circa 200 OPT distribuite in circa 200 comuni. Il dato non indica il numero di utenti contemporanei. [F02, §§2–3 e 6]</w:t>
+        <w:t xml:space="preserve">PICUS supporta il Banco nel coordinamento delle Organizzazioni Partner Territoriali, delle misure di accompagnamento e degli erogatori. Il contesto regionale comprende circa </w:t>
+      </w:r>
+      <w:r>
+        <w:t>450</w:t>
+      </w:r>
+      <w:r>
+        <w:t xml:space="preserve"> OPT</w:t>
+      </w:r>
+      <w:r>
+        <w:t xml:space="preserve"> (</w:t>
+      </w:r>
+      <w:r>
+        <w:t xml:space="preserve">con </w:t>
+      </w:r>
+      <w:r>
+        <w:t>circa 230.000 assistiti)</w:t>
+      </w:r>
+      <w:r>
+        <w:t xml:space="preserve"> distribuite in circa 200 comuni. Il dato non indica il numero di utenti contemporanei. [F02, §§2–3 e 6]</w:t>
       </w:r>
     </w:p>
     <w:p>
@@ -4962,7 +5046,7 @@
     </w:p>
     <w:p>
       <w:pPr>
-        <w:pStyle w:val="Titolo2"/>
+        <w:pStyle w:val="Heading2"/>
       </w:pPr>
       <w:bookmarkStart w:id="3" w:name="_Toc243226338"/>
       <w:r>
@@ -4972,7 +5056,7 @@
     </w:p>
     <w:tbl>
       <w:tblPr>
-        <w:tblStyle w:val="Grigliatabella"/>
+        <w:tblStyle w:val="TableGrid"/>
         <w:tblW w:w="0" w:type="auto"/>
         <w:jc w:val="center"/>
         <w:tblBorders>
@@ -5449,14 +5533,13 @@
     </w:p>
     <w:p>
       <w:pPr>
-        <w:pStyle w:val="Titolo1"/>
+        <w:pStyle w:val="Heading1"/>
         <w:pageBreakBefore/>
       </w:pPr>
       <w:bookmarkStart w:id="4" w:name="_Toc243225285"/>
       <w:bookmarkStart w:id="5" w:name="_Toc243226339"/>
       <w:commentRangeStart w:id="6"/>
       <w:r>
-        <w:lastRenderedPageBreak/>
         <w:t>A2 Stakeholder e contesto</w:t>
       </w:r>
       <w:bookmarkEnd w:id="4"/>
@@ -5464,7 +5547,7 @@
       <w:commentRangeEnd w:id="6"/>
       <w:r>
         <w:rPr>
-          <w:rStyle w:val="Rimandocommento"/>
+          <w:rStyle w:val="CommentReference"/>
           <w:sz w:val="36"/>
           <w:szCs w:val="28"/>
         </w:rPr>
@@ -5484,7 +5567,7 @@
     </w:p>
     <w:tbl>
       <w:tblPr>
-        <w:tblStyle w:val="Grigliatabella"/>
+        <w:tblStyle w:val="TableGrid"/>
         <w:tblW w:w="0" w:type="auto"/>
         <w:jc w:val="center"/>
         <w:tblBorders>
@@ -5553,7 +5636,7 @@
                 <w:color w:val="FFFFFF"/>
                 <w:sz w:val="22"/>
               </w:rPr>
-              <w:t>Obiettivo e responsabilità</w:t>
+              <w:t>Che cosa vuole?</w:t>
             </w:r>
           </w:p>
         </w:tc>
@@ -5574,7 +5657,7 @@
                 <w:color w:val="FFFFFF"/>
                 <w:sz w:val="22"/>
               </w:rPr>
-              <w:t>Interazione o confine</w:t>
+              <w:t>Usa la web app?</w:t>
             </w:r>
           </w:p>
         </w:tc>
@@ -5607,18 +5690,14 @@
           <w:tcPr>
             <w:tcW w:w="4082" w:type="dxa"/>
             <w:shd w:val="clear" w:color="auto" w:fill="FFFFFF"/>
-            <w:vAlign w:val="center"/>
-          </w:tcPr>
-          <w:p>
-            <w:pPr>
-              <w:spacing w:after="20"/>
-              <w:jc w:val="left"/>
-            </w:pPr>
-            <w:r>
-              <w:rPr>
-                <w:sz w:val="22"/>
-              </w:rPr>
-              <w:t>Riceve richieste, individua erogatori, verifica disponibilità e organizza appuntamenti; gestisce account, cataloghi e comunicazioni.</w:t>
+          </w:tcPr>
+          <w:p>
+            <w:pPr>
+              <w:spacing w:after="20"/>
+              <w:jc w:val="left"/>
+            </w:pPr>
+            <w:r>
+              <w:t>Coordina le richieste e trova l'erogatore, monitora le transazioni, gestisce cataloghi e account delle OPT (anche con caricamento massivo), invia comunicazioni con conferma di ricezione, raccoglie i dati per la rendicontazione al ministero.</w:t>
             </w:r>
           </w:p>
         </w:tc>
@@ -5626,18 +5705,14 @@
           <w:tcPr>
             <w:tcW w:w="3628" w:type="dxa"/>
             <w:shd w:val="clear" w:color="auto" w:fill="FFFFFF"/>
-            <w:vAlign w:val="center"/>
-          </w:tcPr>
-          <w:p>
-            <w:pPr>
-              <w:spacing w:after="20"/>
-              <w:jc w:val="left"/>
-            </w:pPr>
-            <w:r>
-              <w:rPr>
-                <w:sz w:val="22"/>
-              </w:rPr>
-              <w:t>Utente applicativo con visibilità complessiva necessaria al coordinamento.</w:t>
+          </w:tcPr>
+          <w:p>
+            <w:pPr>
+              <w:spacing w:after="20"/>
+              <w:jc w:val="left"/>
+            </w:pPr>
+            <w:r>
+              <w:t>Sì, con visione complessiva</w:t>
             </w:r>
           </w:p>
         </w:tc>
@@ -5657,12 +5732,15 @@
             <w:pPr>
               <w:spacing w:after="20"/>
               <w:jc w:val="left"/>
-            </w:pPr>
-            <w:r>
-              <w:rPr>
-                <w:sz w:val="22"/>
-              </w:rPr>
-              <w:t>OPT richiedente</w:t>
+              <w:rPr>
+                <w:sz w:val="22"/>
+              </w:rPr>
+            </w:pPr>
+            <w:r>
+              <w:rPr>
+                <w:sz w:val="22"/>
+              </w:rPr>
+              <w:t>OPT</w:t>
             </w:r>
           </w:p>
         </w:tc>
@@ -5676,12 +5754,15 @@
             <w:pPr>
               <w:spacing w:after="20"/>
               <w:jc w:val="left"/>
-            </w:pPr>
-            <w:r>
-              <w:rPr>
-                <w:sz w:val="22"/>
-              </w:rPr>
-              <w:t>Richiede misure e comunica con la persona o il nucleo assistito.</w:t>
+              <w:rPr>
+                <w:sz w:val="22"/>
+              </w:rPr>
+            </w:pPr>
+            <w:r>
+              <w:rPr>
+                <w:sz w:val="22"/>
+              </w:rPr>
+              <w:t>Chiede una misura per le persone che assiste quando non riesce a soddisfarle da sola, e dichiara le misure che offre agli altri. Un solo accesso per OPT (una email).</w:t>
             </w:r>
           </w:p>
         </w:tc>
@@ -5695,12 +5776,15 @@
             <w:pPr>
               <w:spacing w:after="20"/>
               <w:jc w:val="left"/>
-            </w:pPr>
-            <w:r>
-              <w:rPr>
-                <w:sz w:val="22"/>
-              </w:rPr>
-              <w:t>Utente applicativo: propri dati e proprie richieste; uso frequente da smartphone.</w:t>
+              <w:rPr>
+                <w:sz w:val="22"/>
+              </w:rPr>
+            </w:pPr>
+            <w:r>
+              <w:rPr>
+                <w:sz w:val="22"/>
+              </w:rPr>
+              <w:t>Sì, solo con i propri dati</w:t>
             </w:r>
           </w:p>
         </w:tc>
@@ -5725,7 +5809,7 @@
               <w:rPr>
                 <w:sz w:val="22"/>
               </w:rPr>
-              <w:t>OPT erogatrice</w:t>
+              <w:t>Operatore</w:t>
             </w:r>
           </w:p>
         </w:tc>
@@ -5744,7 +5828,7 @@
               <w:rPr>
                 <w:sz w:val="22"/>
               </w:rPr>
-              <w:t>Dichiara le misure svolte e può erogare un servizio ad altre OPT.</w:t>
+              <w:t>Interni al Centro PICUS o professionisti esterni: erogano le misure, confermano gli appuntamenti e compilano la scheda trimestrale.</w:t>
             </w:r>
           </w:p>
         </w:tc>
@@ -5763,7 +5847,7 @@
               <w:rPr>
                 <w:sz w:val="22"/>
               </w:rPr>
-              <w:t>Stessa organizzazione, con capacità anche di erogazione; chiarire il modello degli account.</w:t>
+              <w:t>Sì, accesso personale</w:t>
             </w:r>
           </w:p>
         </w:tc>
@@ -5788,7 +5872,7 @@
               <w:rPr>
                 <w:sz w:val="22"/>
               </w:rPr>
-              <w:t>Operatore</w:t>
+              <w:t>Persona o nucleo assistito</w:t>
             </w:r>
           </w:p>
         </w:tc>
@@ -5807,7 +5891,25 @@
               <w:rPr>
                 <w:sz w:val="22"/>
               </w:rPr>
-              <w:t>Eroga le attività, conferma appuntamenti e invia la scheda trimestrale.</w:t>
+              <w:t>Ricevono</w:t>
+            </w:r>
+            <w:r>
+              <w:rPr>
+                <w:sz w:val="22"/>
+              </w:rPr>
+              <w:t xml:space="preserve"> la misura tramite </w:t>
+            </w:r>
+            <w:r>
+              <w:rPr>
+                <w:sz w:val="22"/>
+              </w:rPr>
+              <w:t>l'OPT. Nessun accesso e nessun dato identificativo registrato</w:t>
+            </w:r>
+            <w:r>
+              <w:rPr>
+                <w:sz w:val="22"/>
+              </w:rPr>
+              <w:t>.</w:t>
             </w:r>
           </w:p>
         </w:tc>
@@ -5826,7 +5928,7 @@
               <w:rPr>
                 <w:sz w:val="22"/>
               </w:rPr>
-              <w:t>Accesso personale ipotizzato dalla fonte; informazioni strettamente necessarie e propria scheda.</w:t>
+              <w:t>No</w:t>
             </w:r>
           </w:p>
         </w:tc>
@@ -5850,8 +5952,9 @@
             <w:r>
               <w:rPr>
                 <w:sz w:val="22"/>
-              </w:rPr>
-              <w:t>Persona o nucleo assistito</w:t>
+                <w:szCs w:val="22"/>
+              </w:rPr>
+              <w:t>Ministero e responsabile privacy</w:t>
             </w:r>
           </w:p>
         </w:tc>
@@ -5870,7 +5973,7 @@
               <w:rPr>
                 <w:sz w:val="22"/>
               </w:rPr>
-              <w:t>Riceve la misura, tramite il contatto con la OPT.</w:t>
+              <w:t>Il ministero riceve la rendicontazione; il responsabile privacy definisce la conservazione dei dati. Interlocutori dell'analisi, non ruoli applicativi.</w:t>
             </w:r>
           </w:p>
         </w:tc>
@@ -5889,133 +5992,7 @@
               <w:rPr>
                 <w:sz w:val="22"/>
               </w:rPr>
-              <w:t>Stakeholder esterno; nessun accesso e nessun dato identificativo registrato.</w:t>
-            </w:r>
-          </w:p>
-        </w:tc>
-      </w:tr>
-      <w:tr>
-        <w:trPr>
-          <w:cantSplit/>
-          <w:jc w:val="center"/>
-        </w:trPr>
-        <w:tc>
-          <w:tcPr>
-            <w:tcW w:w="1871" w:type="dxa"/>
-            <w:shd w:val="clear" w:color="auto" w:fill="FFFFFF"/>
-            <w:vAlign w:val="center"/>
-          </w:tcPr>
-          <w:p>
-            <w:pPr>
-              <w:spacing w:after="20"/>
-              <w:jc w:val="left"/>
-            </w:pPr>
-            <w:r>
-              <w:rPr>
-                <w:sz w:val="22"/>
-              </w:rPr>
-              <w:t>Responsabili privacy e rendicontazione</w:t>
-            </w:r>
-          </w:p>
-        </w:tc>
-        <w:tc>
-          <w:tcPr>
-            <w:tcW w:w="4082" w:type="dxa"/>
-            <w:shd w:val="clear" w:color="auto" w:fill="FFFFFF"/>
-            <w:vAlign w:val="center"/>
-          </w:tcPr>
-          <w:p>
-            <w:pPr>
-              <w:spacing w:after="20"/>
-              <w:jc w:val="left"/>
-            </w:pPr>
-            <w:r>
-              <w:rPr>
-                <w:sz w:val="22"/>
-              </w:rPr>
-              <w:t>Chiariscono conservazione, accessi e regole amministrative.</w:t>
-            </w:r>
-          </w:p>
-        </w:tc>
-        <w:tc>
-          <w:tcPr>
-            <w:tcW w:w="3628" w:type="dxa"/>
-            <w:shd w:val="clear" w:color="auto" w:fill="FFFFFF"/>
-            <w:vAlign w:val="center"/>
-          </w:tcPr>
-          <w:p>
-            <w:pPr>
-              <w:spacing w:after="20"/>
-              <w:jc w:val="left"/>
-            </w:pPr>
-            <w:r>
-              <w:rPr>
-                <w:sz w:val="22"/>
-              </w:rPr>
-              <w:t>Interlocutori per l’analisi; non ruoli applicativi già definiti.</w:t>
-            </w:r>
-          </w:p>
-        </w:tc>
-      </w:tr>
-      <w:tr>
-        <w:trPr>
-          <w:cantSplit/>
-          <w:jc w:val="center"/>
-        </w:trPr>
-        <w:tc>
-          <w:tcPr>
-            <w:tcW w:w="1871" w:type="dxa"/>
-            <w:shd w:val="clear" w:color="auto" w:fill="FFFFFF"/>
-            <w:vAlign w:val="center"/>
-          </w:tcPr>
-          <w:p>
-            <w:pPr>
-              <w:spacing w:after="20"/>
-              <w:jc w:val="left"/>
-            </w:pPr>
-            <w:r>
-              <w:rPr>
-                <w:sz w:val="22"/>
-              </w:rPr>
-              <w:t>Portale ministeriale</w:t>
-            </w:r>
-          </w:p>
-        </w:tc>
-        <w:tc>
-          <w:tcPr>
-            <w:tcW w:w="4082" w:type="dxa"/>
-            <w:shd w:val="clear" w:color="auto" w:fill="FFFFFF"/>
-            <w:vAlign w:val="center"/>
-          </w:tcPr>
-          <w:p>
-            <w:pPr>
-              <w:spacing w:after="20"/>
-              <w:jc w:val="left"/>
-            </w:pPr>
-            <w:r>
-              <w:rPr>
-                <w:sz w:val="22"/>
-              </w:rPr>
-              <w:t>Destinazione della rendicontazione inserita dal Banco.</w:t>
-            </w:r>
-          </w:p>
-        </w:tc>
-        <w:tc>
-          <w:tcPr>
-            <w:tcW w:w="3628" w:type="dxa"/>
-            <w:shd w:val="clear" w:color="auto" w:fill="FFFFFF"/>
-            <w:vAlign w:val="center"/>
-          </w:tcPr>
-          <w:p>
-            <w:pPr>
-              <w:spacing w:after="20"/>
-              <w:jc w:val="left"/>
-            </w:pPr>
-            <w:r>
-              <w:rPr>
-                <w:sz w:val="22"/>
-              </w:rPr>
-              <w:t>Sistema esterno senza interfaccia diretta richiesta.</w:t>
+              <w:t>No</w:t>
             </w:r>
           </w:p>
         </w:tc>
@@ -6039,7 +6016,7 @@
     </w:p>
     <w:p>
       <w:pPr>
-        <w:pStyle w:val="Titolo2"/>
+        <w:pStyle w:val="Heading2"/>
       </w:pPr>
       <w:bookmarkStart w:id="10" w:name="_Toc243226340"/>
       <w:r>
@@ -6048,50 +6025,91 @@
       <w:bookmarkEnd w:id="10"/>
     </w:p>
     <w:p>
+      <w:pPr>
+        <w:rPr>
+          <w:iCs/>
+        </w:rPr>
+      </w:pPr>
+      <w:r>
+        <w:rPr>
+          <w:iCs/>
+          <w:noProof/>
+          <w:color w:val="606060"/>
+        </w:rPr>
+        <w:drawing>
+          <wp:inline distT="0" distB="0" distL="0" distR="0" wp14:anchorId="5DAA6679" wp14:editId="38E87603">
+            <wp:extent cx="6133465" cy="2475865"/>
+            <wp:effectExtent l="0" t="0" r="635" b="635"/>
+            <wp:docPr id="2033031832" name="Immagine 5"/>
+            <wp:cNvGraphicFramePr>
+              <a:graphicFrameLocks xmlns:a="http://schemas.openxmlformats.org/drawingml/2006/main" noChangeAspect="1"/>
+            </wp:cNvGraphicFramePr>
+            <a:graphic xmlns:a="http://schemas.openxmlformats.org/drawingml/2006/main">
+              <a:graphicData uri="http://schemas.openxmlformats.org/drawingml/2006/picture">
+                <pic:pic xmlns:pic="http://schemas.openxmlformats.org/drawingml/2006/picture">
+                  <pic:nvPicPr>
+                    <pic:cNvPr id="0" name="Picture 3"/>
+                    <pic:cNvPicPr>
+                      <a:picLocks noChangeAspect="1" noChangeArrowheads="1"/>
+                    </pic:cNvPicPr>
+                  </pic:nvPicPr>
+                  <pic:blipFill>
+                    <a:blip r:embed="rId15">
+                      <a:extLst>
+                        <a:ext uri="{28A0092B-C50C-407E-A947-70E740481C1C}">
+                          <a14:useLocalDpi xmlns:a14="http://schemas.microsoft.com/office/drawing/2010/main" val="0"/>
+                        </a:ext>
+                      </a:extLst>
+                    </a:blip>
+                    <a:srcRect/>
+                    <a:stretch>
+                      <a:fillRect/>
+                    </a:stretch>
+                  </pic:blipFill>
+                  <pic:spPr bwMode="auto">
+                    <a:xfrm>
+                      <a:off x="0" y="0"/>
+                      <a:ext cx="6133465" cy="2475865"/>
+                    </a:xfrm>
+                    <a:prstGeom prst="rect">
+                      <a:avLst/>
+                    </a:prstGeom>
+                    <a:noFill/>
+                    <a:ln>
+                      <a:noFill/>
+                    </a:ln>
+                  </pic:spPr>
+                </pic:pic>
+              </a:graphicData>
+            </a:graphic>
+          </wp:inline>
+        </w:drawing>
+      </w:r>
+    </w:p>
+    <w:p>
       <w:r>
         <w:rPr>
           <w:b/>
         </w:rPr>
-        <w:t xml:space="preserve">Artefatto </w:t>
+        <w:t xml:space="preserve">Revisione </w:t>
       </w:r>
       <w:r>
         <w:rPr>
           <w:i/>
           <w:color w:val="606060"/>
         </w:rPr>
-        <w:t>Da produrre in S1-01 e collegare qui con versione, data e percorso del file Visual Paradigm o esportazione leggibile.</w:t>
-      </w:r>
-    </w:p>
-    <w:p>
-      <w:r>
-        <w:t>Rappresentare il confine di PICUS e gli scambi informativi di Banco, OPT e operatori. Mostrare gli assistiti come soggetti esterni al sistema e il contatto mediato dalla OPT. Separare il passaggio manuale al portale ministeriale dalle interazioni applicative.</w:t>
-      </w:r>
-    </w:p>
-    <w:p>
-      <w:r>
-        <w:rPr>
-          <w:b/>
-        </w:rPr>
-        <w:t xml:space="preserve">Revisione </w:t>
-      </w:r>
-      <w:r>
-        <w:rPr>
-          <w:i/>
-          <w:color w:val="606060"/>
-        </w:rPr>
         <w:t>Da indicare: revisore, data, punti verificati e questioni collegate.</w:t>
       </w:r>
     </w:p>
     <w:p>
       <w:pPr>
-        <w:pStyle w:val="Titolo1"/>
+        <w:pStyle w:val="Heading1"/>
         <w:pageBreakBefore/>
       </w:pPr>
       <w:bookmarkStart w:id="11" w:name="_Toc243225286"/>
       <w:bookmarkStart w:id="12" w:name="_Toc243226341"/>
       <w:commentRangeStart w:id="13"/>
       <w:r>
-        <w:lastRenderedPageBreak/>
         <w:t>A3 Processo attuale e processo proposto</w:t>
       </w:r>
       <w:bookmarkEnd w:id="11"/>
@@ -6099,7 +6117,7 @@
       <w:commentRangeEnd w:id="13"/>
       <w:r>
         <w:rPr>
-          <w:rStyle w:val="Rimandocommento"/>
+          <w:rStyle w:val="CommentReference"/>
           <w:sz w:val="36"/>
           <w:szCs w:val="28"/>
         </w:rPr>
@@ -6108,7 +6126,7 @@
     </w:p>
     <w:p>
       <w:pPr>
-        <w:pStyle w:val="Titolo2"/>
+        <w:pStyle w:val="Heading2"/>
       </w:pPr>
       <w:bookmarkStart w:id="16" w:name="_Toc243226342"/>
       <w:r>
@@ -6129,7 +6147,7 @@
     </w:p>
     <w:tbl>
       <w:tblPr>
-        <w:tblStyle w:val="Grigliatabella"/>
+        <w:tblStyle w:val="TableGrid"/>
         <w:tblW w:w="0" w:type="auto"/>
         <w:jc w:val="center"/>
         <w:tblBorders>
@@ -6547,7 +6565,7 @@
     </w:p>
     <w:p>
       <w:pPr>
-        <w:pStyle w:val="Titolo2"/>
+        <w:pStyle w:val="Heading2"/>
       </w:pPr>
       <w:bookmarkStart w:id="17" w:name="_Toc243226343"/>
       <w:r>
@@ -6577,7 +6595,7 @@
     </w:p>
     <w:tbl>
       <w:tblPr>
-        <w:tblStyle w:val="Grigliatabella"/>
+        <w:tblStyle w:val="TableGrid"/>
         <w:tblW w:w="0" w:type="auto"/>
         <w:jc w:val="center"/>
         <w:tblBorders>
@@ -6748,19 +6766,18 @@
     </w:p>
     <w:p>
       <w:pPr>
-        <w:pStyle w:val="Titolo2"/>
+        <w:pStyle w:val="Heading2"/>
       </w:pPr>
       <w:bookmarkStart w:id="18" w:name="_Toc243226344"/>
       <w:commentRangeStart w:id="19"/>
       <w:r>
-        <w:lastRenderedPageBreak/>
         <w:t>Processo migliorato to be</w:t>
       </w:r>
       <w:bookmarkEnd w:id="18"/>
       <w:commentRangeEnd w:id="19"/>
       <w:r>
         <w:rPr>
-          <w:rStyle w:val="Rimandocommento"/>
+          <w:rStyle w:val="CommentReference"/>
           <w:sz w:val="28"/>
           <w:szCs w:val="26"/>
         </w:rPr>
@@ -6800,7 +6817,7 @@
     </w:p>
     <w:p>
       <w:pPr>
-        <w:pStyle w:val="Titolo2"/>
+        <w:pStyle w:val="Heading2"/>
       </w:pPr>
       <w:bookmarkStart w:id="22" w:name="_Toc243226345"/>
       <w:r>
@@ -6900,7 +6917,7 @@
     </w:p>
     <w:p>
       <w:pPr>
-        <w:pStyle w:val="Titolo2"/>
+        <w:pStyle w:val="Heading2"/>
       </w:pPr>
       <w:bookmarkStart w:id="23" w:name="_Toc243226346"/>
       <w:r>
@@ -6915,7 +6932,7 @@
     </w:p>
     <w:tbl>
       <w:tblPr>
-        <w:tblStyle w:val="Grigliatabella"/>
+        <w:tblStyle w:val="TableGrid"/>
         <w:tblW w:w="0" w:type="auto"/>
         <w:jc w:val="center"/>
         <w:tblBorders>
@@ -7092,7 +7109,7 @@
     </w:p>
     <w:p>
       <w:pPr>
-        <w:pStyle w:val="Titolo1"/>
+        <w:pStyle w:val="Heading1"/>
         <w:pageBreakBefore/>
         <w:rPr>
           <w:lang w:val="en-US"/>
@@ -7104,7 +7121,6 @@
         <w:rPr>
           <w:lang w:val="en-US"/>
         </w:rPr>
-        <w:lastRenderedPageBreak/>
         <w:t>A4 Epic backlog e User Story</w:t>
       </w:r>
       <w:bookmarkEnd w:id="24"/>
@@ -7122,7 +7138,7 @@
       </w:r>
     </w:p>
     <w:p>
-      <w:hyperlink r:id="rId15">
+      <w:hyperlink r:id="rId16">
         <w:r>
           <w:rPr>
             <w:color w:val="31849B"/>
@@ -7134,7 +7150,7 @@
     </w:p>
     <w:p>
       <w:pPr>
-        <w:pStyle w:val="Titolo2"/>
+        <w:pStyle w:val="Heading2"/>
       </w:pPr>
       <w:bookmarkStart w:id="26" w:name="_Toc243226348"/>
       <w:r>
@@ -7149,7 +7165,7 @@
     </w:p>
     <w:tbl>
       <w:tblPr>
-        <w:tblStyle w:val="Grigliatabella"/>
+        <w:tblStyle w:val="TableGrid"/>
         <w:tblW w:w="0" w:type="auto"/>
         <w:jc w:val="center"/>
         <w:tblBorders>
@@ -7315,7 +7331,7 @@
     </w:p>
     <w:p>
       <w:pPr>
-        <w:pStyle w:val="Titolo2"/>
+        <w:pStyle w:val="Heading2"/>
       </w:pPr>
       <w:bookmarkStart w:id="27" w:name="_Toc243226349"/>
       <w:r>
@@ -7340,7 +7356,7 @@
     </w:p>
     <w:tbl>
       <w:tblPr>
-        <w:tblStyle w:val="Grigliatabella"/>
+        <w:tblStyle w:val="TableGrid"/>
         <w:tblW w:w="0" w:type="auto"/>
         <w:jc w:val="center"/>
         <w:tblBorders>
@@ -7558,7 +7574,7 @@
     </w:p>
     <w:p>
       <w:pPr>
-        <w:pStyle w:val="Titolo2"/>
+        <w:pStyle w:val="Heading2"/>
       </w:pPr>
       <w:bookmarkStart w:id="28" w:name="_Toc243226350"/>
       <w:r>
@@ -7589,11 +7605,10 @@
     </w:p>
     <w:p>
       <w:pPr>
-        <w:pStyle w:val="Titolo2"/>
+        <w:pStyle w:val="Heading2"/>
       </w:pPr>
       <w:bookmarkStart w:id="29" w:name="_Toc243226351"/>
       <w:r>
-        <w:lastRenderedPageBreak/>
         <w:t>Scheda riutilizzabile della User Story</w:t>
       </w:r>
       <w:bookmarkEnd w:id="29"/>
@@ -7690,7 +7705,7 @@
     </w:p>
     <w:p>
       <w:pPr>
-        <w:pStyle w:val="Titolo2"/>
+        <w:pStyle w:val="Heading2"/>
       </w:pPr>
       <w:bookmarkStart w:id="30" w:name="_Toc243226352"/>
       <w:r>
@@ -7700,7 +7715,7 @@
     </w:p>
     <w:tbl>
       <w:tblPr>
-        <w:tblStyle w:val="Grigliatabella"/>
+        <w:tblStyle w:val="TableGrid"/>
         <w:tblW w:w="0" w:type="auto"/>
         <w:jc w:val="center"/>
         <w:tblBorders>
@@ -7944,7 +7959,7 @@
     </w:p>
     <w:p>
       <w:pPr>
-        <w:pStyle w:val="Titolo2"/>
+        <w:pStyle w:val="Heading2"/>
       </w:pPr>
       <w:bookmarkStart w:id="31" w:name="_Toc243226353"/>
       <w:r>
@@ -7954,7 +7969,7 @@
     </w:p>
     <w:tbl>
       <w:tblPr>
-        <w:tblStyle w:val="Grigliatabella"/>
+        <w:tblStyle w:val="TableGrid"/>
         <w:tblW w:w="0" w:type="auto"/>
         <w:jc w:val="center"/>
         <w:tblBorders>
@@ -8325,13 +8340,12 @@
     </w:p>
     <w:p>
       <w:pPr>
-        <w:pStyle w:val="Titolo1"/>
+        <w:pStyle w:val="Heading1"/>
         <w:pageBreakBefore/>
       </w:pPr>
       <w:bookmarkStart w:id="32" w:name="_Toc243225288"/>
       <w:bookmarkStart w:id="33" w:name="_Toc243226354"/>
       <w:r>
-        <w:lastRenderedPageBreak/>
         <w:t>A5 Dati e scenari di qualità</w:t>
       </w:r>
       <w:bookmarkEnd w:id="32"/>
@@ -8339,7 +8353,7 @@
     </w:p>
     <w:p>
       <w:pPr>
-        <w:pStyle w:val="Titolo2"/>
+        <w:pStyle w:val="Heading2"/>
       </w:pPr>
       <w:bookmarkStart w:id="34" w:name="_Toc243226355"/>
       <w:r>
@@ -8349,7 +8363,7 @@
     </w:p>
     <w:tbl>
       <w:tblPr>
-        <w:tblStyle w:val="Grigliatabella"/>
+        <w:tblStyle w:val="TableGrid"/>
         <w:tblW w:w="0" w:type="auto"/>
         <w:jc w:val="center"/>
         <w:tblBorders>
@@ -8893,7 +8907,7 @@
     </w:p>
     <w:p>
       <w:pPr>
-        <w:pStyle w:val="Titolo2"/>
+        <w:pStyle w:val="Heading2"/>
       </w:pPr>
       <w:bookmarkStart w:id="35" w:name="_Toc243226356"/>
       <w:r>
@@ -8918,11 +8932,10 @@
     </w:p>
     <w:p>
       <w:pPr>
-        <w:pStyle w:val="Titolo2"/>
+        <w:pStyle w:val="Heading2"/>
       </w:pPr>
       <w:bookmarkStart w:id="36" w:name="_Toc243226357"/>
       <w:r>
-        <w:lastRenderedPageBreak/>
         <w:t>Quality Scenario Catalogue</w:t>
       </w:r>
       <w:bookmarkEnd w:id="36"/>
@@ -8940,7 +8953,7 @@
     </w:p>
     <w:tbl>
       <w:tblPr>
-        <w:tblStyle w:val="Grigliatabella"/>
+        <w:tblStyle w:val="TableGrid"/>
         <w:tblW w:w="0" w:type="auto"/>
         <w:jc w:val="center"/>
         <w:tblBorders>
@@ -9296,7 +9309,7 @@
     </w:p>
     <w:p>
       <w:pPr>
-        <w:pStyle w:val="Titolo2"/>
+        <w:pStyle w:val="Heading2"/>
       </w:pPr>
       <w:bookmarkStart w:id="37" w:name="_Toc243226358"/>
       <w:r>
@@ -9437,13 +9450,12 @@
     </w:p>
     <w:p>
       <w:pPr>
-        <w:pStyle w:val="Titolo1"/>
+        <w:pStyle w:val="Heading1"/>
         <w:pageBreakBefore/>
       </w:pPr>
       <w:bookmarkStart w:id="38" w:name="_Toc243225289"/>
       <w:bookmarkStart w:id="39" w:name="_Toc243226359"/>
       <w:r>
-        <w:lastRenderedPageBreak/>
         <w:t>A6 Domande aperte e ipotesi</w:t>
       </w:r>
       <w:bookmarkEnd w:id="38"/>
@@ -9462,7 +9474,7 @@
     </w:p>
     <w:tbl>
       <w:tblPr>
-        <w:tblStyle w:val="Grigliatabella"/>
+        <w:tblStyle w:val="TableGrid"/>
         <w:tblW w:w="0" w:type="auto"/>
         <w:jc w:val="center"/>
         <w:tblBorders>
@@ -10085,11 +10097,10 @@
     </w:p>
     <w:p>
       <w:pPr>
-        <w:pStyle w:val="Titolo2"/>
+        <w:pStyle w:val="Heading2"/>
       </w:pPr>
       <w:bookmarkStart w:id="40" w:name="_Toc243226360"/>
       <w:r>
-        <w:lastRenderedPageBreak/>
         <w:t>Scheda riutilizzabile di domanda e ipotesi</w:t>
       </w:r>
       <w:bookmarkEnd w:id="40"/>
@@ -10216,7 +10227,7 @@
     </w:p>
     <w:p>
       <w:pPr>
-        <w:pStyle w:val="Titolo2"/>
+        <w:pStyle w:val="Heading2"/>
       </w:pPr>
       <w:bookmarkStart w:id="41" w:name="_Toc243226361"/>
       <w:r>
@@ -10236,7 +10247,7 @@
     </w:p>
     <w:tbl>
       <w:tblPr>
-        <w:tblStyle w:val="Grigliatabella"/>
+        <w:tblStyle w:val="TableGrid"/>
         <w:tblW w:w="0" w:type="auto"/>
         <w:jc w:val="center"/>
         <w:tblBorders>
@@ -10402,13 +10413,12 @@
     </w:p>
     <w:p>
       <w:pPr>
-        <w:pStyle w:val="Titolo1"/>
+        <w:pStyle w:val="Heading1"/>
         <w:pageBreakBefore/>
       </w:pPr>
       <w:bookmarkStart w:id="42" w:name="_Toc243225290"/>
       <w:bookmarkStart w:id="43" w:name="_Toc243226362"/>
       <w:r>
-        <w:lastRenderedPageBreak/>
         <w:t>A7 Proposta di MVP</w:t>
       </w:r>
       <w:bookmarkEnd w:id="42"/>
@@ -10457,7 +10467,7 @@
     </w:p>
     <w:tbl>
       <w:tblPr>
-        <w:tblStyle w:val="Grigliatabella"/>
+        <w:tblStyle w:val="TableGrid"/>
         <w:tblW w:w="0" w:type="auto"/>
         <w:jc w:val="center"/>
         <w:tblBorders>
@@ -10713,7 +10723,7 @@
     </w:p>
     <w:p>
       <w:pPr>
-        <w:pStyle w:val="Titolo2"/>
+        <w:pStyle w:val="Heading2"/>
       </w:pPr>
       <w:bookmarkStart w:id="44" w:name="_Toc243226363"/>
       <w:r>
@@ -10739,13 +10749,12 @@
     </w:p>
     <w:p>
       <w:pPr>
-        <w:pStyle w:val="Titolo1"/>
+        <w:pStyle w:val="Heading1"/>
         <w:pageBreakBefore/>
       </w:pPr>
       <w:bookmarkStart w:id="45" w:name="_Toc243225291"/>
       <w:bookmarkStart w:id="46" w:name="_Toc243226364"/>
       <w:r>
-        <w:lastRenderedPageBreak/>
         <w:t>A8 Architettura e decisioni tecniche</w:t>
       </w:r>
       <w:bookmarkEnd w:id="45"/>
@@ -10758,7 +10767,7 @@
     </w:p>
     <w:p>
       <w:pPr>
-        <w:pStyle w:val="Titolo2"/>
+        <w:pStyle w:val="Heading2"/>
       </w:pPr>
       <w:bookmarkStart w:id="47" w:name="_Toc243226365"/>
       <w:r>
@@ -10768,7 +10777,7 @@
     </w:p>
     <w:tbl>
       <w:tblPr>
-        <w:tblStyle w:val="Grigliatabella"/>
+        <w:tblStyle w:val="TableGrid"/>
         <w:tblW w:w="0" w:type="auto"/>
         <w:jc w:val="center"/>
         <w:tblBorders>
@@ -11205,7 +11214,7 @@
     </w:p>
     <w:p>
       <w:pPr>
-        <w:pStyle w:val="Titolo2"/>
+        <w:pStyle w:val="Heading2"/>
       </w:pPr>
       <w:bookmarkStart w:id="48" w:name="_Toc243226366"/>
       <w:r>
@@ -11215,7 +11224,7 @@
     </w:p>
     <w:tbl>
       <w:tblPr>
-        <w:tblStyle w:val="Grigliatabella"/>
+        <w:tblStyle w:val="TableGrid"/>
         <w:tblW w:w="0" w:type="auto"/>
         <w:jc w:val="center"/>
         <w:tblBorders>
@@ -11482,11 +11491,10 @@
     </w:p>
     <w:p>
       <w:pPr>
-        <w:pStyle w:val="Titolo2"/>
+        <w:pStyle w:val="Heading2"/>
       </w:pPr>
       <w:bookmarkStart w:id="49" w:name="_Toc243226367"/>
       <w:r>
-        <w:lastRenderedPageBreak/>
         <w:t>Confini modulari e qualità</w:t>
       </w:r>
       <w:bookmarkEnd w:id="49"/>
@@ -11508,7 +11516,7 @@
     </w:p>
     <w:p>
       <w:pPr>
-        <w:pStyle w:val="Titolo2"/>
+        <w:pStyle w:val="Heading2"/>
       </w:pPr>
       <w:bookmarkStart w:id="50" w:name="_Toc243226368"/>
       <w:r>
@@ -11523,7 +11531,7 @@
     </w:p>
     <w:tbl>
       <w:tblPr>
-        <w:tblStyle w:val="Grigliatabella"/>
+        <w:tblStyle w:val="TableGrid"/>
         <w:tblW w:w="0" w:type="auto"/>
         <w:jc w:val="center"/>
         <w:tblBorders>
@@ -11835,7 +11843,7 @@
     </w:p>
     <w:p>
       <w:pPr>
-        <w:pStyle w:val="Titolo2"/>
+        <w:pStyle w:val="Heading2"/>
       </w:pPr>
       <w:bookmarkStart w:id="51" w:name="_Toc243226369"/>
       <w:r>
@@ -11880,11 +11888,10 @@
     </w:p>
     <w:p>
       <w:pPr>
-        <w:pStyle w:val="Titolo2"/>
+        <w:pStyle w:val="Heading2"/>
       </w:pPr>
       <w:bookmarkStart w:id="52" w:name="_Toc243226370"/>
       <w:r>
-        <w:lastRenderedPageBreak/>
         <w:t>Scheda riutilizzabile di Architecture Decision Record</w:t>
       </w:r>
       <w:bookmarkEnd w:id="52"/>
@@ -12011,7 +12018,7 @@
     </w:p>
     <w:p>
       <w:pPr>
-        <w:pStyle w:val="Titolo2"/>
+        <w:pStyle w:val="Heading2"/>
       </w:pPr>
       <w:bookmarkStart w:id="53" w:name="_Toc243226371"/>
       <w:r>
@@ -12021,7 +12028,7 @@
     </w:p>
     <w:tbl>
       <w:tblPr>
-        <w:tblStyle w:val="Grigliatabella"/>
+        <w:tblStyle w:val="TableGrid"/>
         <w:tblW w:w="0" w:type="auto"/>
         <w:jc w:val="center"/>
         <w:tblBorders>
@@ -12439,13 +12446,12 @@
     </w:p>
     <w:p>
       <w:pPr>
-        <w:pStyle w:val="Titolo1"/>
+        <w:pStyle w:val="Heading1"/>
         <w:pageBreakBefore/>
       </w:pPr>
       <w:bookmarkStart w:id="54" w:name="_Toc243225292"/>
       <w:bookmarkStart w:id="55" w:name="_Toc243226372"/>
       <w:r>
-        <w:lastRenderedPageBreak/>
         <w:t>A9 Incrementi verifiche ed esecuzione</w:t>
       </w:r>
       <w:bookmarkEnd w:id="54"/>
@@ -12458,7 +12464,7 @@
     </w:p>
     <w:p>
       <w:pPr>
-        <w:pStyle w:val="Titolo2"/>
+        <w:pStyle w:val="Heading2"/>
       </w:pPr>
       <w:bookmarkStart w:id="56" w:name="_Toc243226373"/>
       <w:r>
@@ -12468,7 +12474,7 @@
     </w:p>
     <w:tbl>
       <w:tblPr>
-        <w:tblStyle w:val="Grigliatabella"/>
+        <w:tblStyle w:val="TableGrid"/>
         <w:tblW w:w="0" w:type="auto"/>
         <w:jc w:val="center"/>
         <w:tblBorders>
@@ -12634,7 +12640,7 @@
     </w:p>
     <w:p>
       <w:pPr>
-        <w:pStyle w:val="Titolo2"/>
+        <w:pStyle w:val="Heading2"/>
       </w:pPr>
       <w:bookmarkStart w:id="57" w:name="_Toc243226374"/>
       <w:r>
@@ -12659,7 +12665,7 @@
     </w:p>
     <w:p>
       <w:pPr>
-        <w:pStyle w:val="Titolo2"/>
+        <w:pStyle w:val="Heading2"/>
       </w:pPr>
       <w:bookmarkStart w:id="58" w:name="_Toc243226375"/>
       <w:r>
@@ -12764,11 +12770,10 @@
     </w:p>
     <w:p>
       <w:pPr>
-        <w:pStyle w:val="Titolo2"/>
+        <w:pStyle w:val="Heading2"/>
       </w:pPr>
       <w:bookmarkStart w:id="59" w:name="_Toc243226376"/>
       <w:r>
-        <w:lastRenderedPageBreak/>
         <w:t>Istruzioni riproducibili e deployment</w:t>
       </w:r>
       <w:bookmarkEnd w:id="59"/>
@@ -12780,7 +12785,7 @@
     </w:p>
     <w:tbl>
       <w:tblPr>
-        <w:tblStyle w:val="Grigliatabella"/>
+        <w:tblStyle w:val="TableGrid"/>
         <w:tblW w:w="0" w:type="auto"/>
         <w:jc w:val="center"/>
         <w:tblBorders>
@@ -13213,7 +13218,7 @@
     </w:p>
     <w:p>
       <w:pPr>
-        <w:pStyle w:val="Titolo2"/>
+        <w:pStyle w:val="Heading2"/>
       </w:pPr>
       <w:bookmarkStart w:id="60" w:name="_Toc243226377"/>
       <w:r>
@@ -13244,14 +13249,13 @@
     </w:p>
     <w:p>
       <w:pPr>
-        <w:pStyle w:val="Titolo1"/>
+        <w:pStyle w:val="Heading1"/>
         <w:pageBreakBefore/>
       </w:pPr>
       <w:bookmarkStart w:id="61" w:name="_Toc243225293"/>
       <w:bookmarkStart w:id="62" w:name="_Toc243226378"/>
       <w:bookmarkStart w:id="63" w:name="PicusOrganization"/>
       <w:r>
-        <w:lastRenderedPageBreak/>
         <w:t>B1 Team e collaborazione</w:t>
       </w:r>
       <w:bookmarkEnd w:id="61"/>
@@ -13259,7 +13263,7 @@
     </w:p>
     <w:tbl>
       <w:tblPr>
-        <w:tblStyle w:val="Grigliatabella"/>
+        <w:tblStyle w:val="TableGrid"/>
         <w:tblW w:w="0" w:type="auto"/>
         <w:jc w:val="center"/>
         <w:tblBorders>
@@ -13871,14 +13875,14 @@
     </w:p>
     <w:p>
       <w:pPr>
-        <w:pStyle w:val="Titolo2"/>
+        <w:pStyle w:val="Heading2"/>
       </w:pPr>
       <w:r>
         <w:t>Repository e integrazione</w:t>
       </w:r>
     </w:p>
     <w:p>
-      <w:hyperlink r:id="rId16">
+      <w:hyperlink r:id="rId17">
         <w:r>
           <w:rPr>
             <w:color w:val="31849B"/>
@@ -13889,7 +13893,7 @@
       </w:hyperlink>
     </w:p>
     <w:p>
-      <w:hyperlink r:id="rId17">
+      <w:hyperlink r:id="rId18">
         <w:r>
           <w:rPr>
             <w:color w:val="31849B"/>
@@ -13927,10 +13931,9 @@
     </w:p>
     <w:p>
       <w:pPr>
-        <w:pStyle w:val="Titolo2"/>
-      </w:pPr>
-      <w:r>
-        <w:lastRenderedPageBreak/>
+        <w:pStyle w:val="Heading2"/>
+      </w:pPr>
+      <w:r>
         <w:t>Configurazione operativa del GitHub Project</w:t>
       </w:r>
     </w:p>
@@ -13947,7 +13950,7 @@
     </w:p>
     <w:tbl>
       <w:tblPr>
-        <w:tblStyle w:val="Grigliatabella"/>
+        <w:tblStyle w:val="TableGrid"/>
         <w:tblW w:w="0" w:type="auto"/>
         <w:jc w:val="center"/>
         <w:tblBorders>
@@ -14296,7 +14299,7 @@
     </w:p>
     <w:tbl>
       <w:tblPr>
-        <w:tblStyle w:val="Grigliatabella"/>
+        <w:tblStyle w:val="TableGrid"/>
         <w:tblW w:w="0" w:type="auto"/>
         <w:jc w:val="center"/>
         <w:tblBorders>
@@ -14514,7 +14517,7 @@
     </w:p>
     <w:p>
       <w:pPr>
-        <w:pStyle w:val="Titolo2"/>
+        <w:pStyle w:val="Heading2"/>
       </w:pPr>
       <w:r>
         <w:t>Eventi e aggiornamenti</w:t>
@@ -14527,13 +14530,12 @@
     </w:p>
     <w:p>
       <w:pPr>
-        <w:pStyle w:val="Titolo1"/>
+        <w:pStyle w:val="Heading1"/>
         <w:pageBreakBefore/>
       </w:pPr>
       <w:bookmarkStart w:id="64" w:name="_Toc243225294"/>
       <w:bookmarkStart w:id="65" w:name="_Toc243226379"/>
       <w:r>
-        <w:lastRenderedPageBreak/>
         <w:t>B2 Calendario e criteri di completamento</w:t>
       </w:r>
       <w:bookmarkEnd w:id="64"/>
@@ -14541,7 +14543,7 @@
     </w:p>
     <w:tbl>
       <w:tblPr>
-        <w:tblStyle w:val="Grigliatabella"/>
+        <w:tblStyle w:val="TableGrid"/>
         <w:tblW w:w="0" w:type="auto"/>
         <w:jc w:val="center"/>
         <w:tblBorders>
@@ -14912,7 +14914,7 @@
     </w:p>
     <w:p>
       <w:pPr>
-        <w:pStyle w:val="Titolo2"/>
+        <w:pStyle w:val="Heading2"/>
       </w:pPr>
       <w:r>
         <w:t>Criteri per gli artefatti preparatori</w:t>
@@ -14925,7 +14927,7 @@
     </w:p>
     <w:tbl>
       <w:tblPr>
-        <w:tblStyle w:val="Grigliatabella"/>
+        <w:tblStyle w:val="TableGrid"/>
         <w:tblW w:w="0" w:type="auto"/>
         <w:jc w:val="center"/>
         <w:tblBorders>
@@ -15275,10 +15277,9 @@
     </w:p>
     <w:p>
       <w:pPr>
-        <w:pStyle w:val="Titolo2"/>
-      </w:pPr>
-      <w:r>
-        <w:lastRenderedPageBreak/>
+        <w:pStyle w:val="Heading2"/>
+      </w:pPr>
+      <w:r>
         <w:t>Definition of Done per gli incrementi software</w:t>
       </w:r>
     </w:p>
@@ -15289,7 +15290,7 @@
     </w:p>
     <w:tbl>
       <w:tblPr>
-        <w:tblStyle w:val="Grigliatabella"/>
+        <w:tblStyle w:val="TableGrid"/>
         <w:tblW w:w="0" w:type="auto"/>
         <w:jc w:val="center"/>
         <w:tblBorders>
@@ -15693,7 +15694,7 @@
     </w:p>
     <w:p>
       <w:pPr>
-        <w:pStyle w:val="Titolo2"/>
+        <w:pStyle w:val="Heading2"/>
       </w:pPr>
       <w:r>
         <w:t>Ready e pratiche facoltative</w:t>
@@ -15717,13 +15718,12 @@
     </w:p>
     <w:p>
       <w:pPr>
-        <w:pStyle w:val="Titolo1"/>
+        <w:pStyle w:val="Heading1"/>
         <w:pageBreakBefore/>
       </w:pPr>
       <w:bookmarkStart w:id="66" w:name="_Toc243225295"/>
       <w:bookmarkStart w:id="67" w:name="_Toc243226380"/>
       <w:r>
-        <w:lastRenderedPageBreak/>
         <w:t>C1 Registro della preparazione</w:t>
       </w:r>
       <w:bookmarkEnd w:id="66"/>
@@ -15768,7 +15768,7 @@
     </w:p>
     <w:p>
       <w:pPr>
-        <w:pStyle w:val="Titolo2"/>
+        <w:pStyle w:val="Heading2"/>
       </w:pPr>
       <w:r>
         <w:t>Attività preparatorie concordate</w:t>
@@ -15776,7 +15776,7 @@
     </w:p>
     <w:tbl>
       <w:tblPr>
-        <w:tblStyle w:val="Grigliatabella"/>
+        <w:tblStyle w:val="TableGrid"/>
         <w:tblW w:w="0" w:type="auto"/>
         <w:jc w:val="center"/>
         <w:tblBorders>
@@ -16555,10 +16555,9 @@
     </w:p>
     <w:p>
       <w:pPr>
-        <w:pStyle w:val="Titolo2"/>
-      </w:pPr>
-      <w:r>
-        <w:lastRenderedPageBreak/>
+        <w:pStyle w:val="Heading2"/>
+      </w:pPr>
+      <w:r>
         <w:t>Resoconto della review preparatoria</w:t>
       </w:r>
     </w:p>
@@ -16579,7 +16578,7 @@
     </w:p>
     <w:tbl>
       <w:tblPr>
-        <w:tblStyle w:val="Grigliatabella"/>
+        <w:tblStyle w:val="TableGrid"/>
         <w:tblW w:w="0" w:type="auto"/>
         <w:jc w:val="center"/>
         <w:tblBorders>
@@ -16805,7 +16804,7 @@
     </w:p>
     <w:p>
       <w:pPr>
-        <w:pStyle w:val="Titolo2"/>
+        <w:pStyle w:val="Heading2"/>
       </w:pPr>
       <w:r>
         <w:t>Scaletta proposta per i 10 minuti</w:t>
@@ -16818,7 +16817,7 @@
     </w:p>
     <w:p>
       <w:pPr>
-        <w:pStyle w:val="Titolo2"/>
+        <w:pStyle w:val="Heading2"/>
       </w:pPr>
       <w:r>
         <w:t>Retrospective distinta dalla Review</w:t>
@@ -16841,7 +16840,7 @@
     </w:p>
     <w:tbl>
       <w:tblPr>
-        <w:tblStyle w:val="Grigliatabella"/>
+        <w:tblStyle w:val="TableGrid"/>
         <w:tblW w:w="0" w:type="auto"/>
         <w:jc w:val="center"/>
         <w:tblBorders>
@@ -17022,13 +17021,12 @@
     </w:p>
     <w:p>
       <w:pPr>
-        <w:pStyle w:val="Titolo1"/>
+        <w:pStyle w:val="Heading1"/>
         <w:pageBreakBefore/>
       </w:pPr>
       <w:bookmarkStart w:id="68" w:name="_Toc243225296"/>
       <w:bookmarkStart w:id="69" w:name="_Toc243226381"/>
       <w:r>
-        <w:lastRenderedPageBreak/>
         <w:t>C2 Registro della costruzione 1</w:t>
       </w:r>
       <w:bookmarkEnd w:id="68"/>
@@ -17204,13 +17202,12 @@
     </w:p>
     <w:p>
       <w:pPr>
-        <w:pStyle w:val="Titolo1"/>
+        <w:pStyle w:val="Heading1"/>
         <w:pageBreakBefore/>
       </w:pPr>
       <w:bookmarkStart w:id="70" w:name="_Toc243225297"/>
       <w:bookmarkStart w:id="71" w:name="_Toc243226382"/>
       <w:r>
-        <w:lastRenderedPageBreak/>
         <w:t>C3 Registro della costruzione 2</w:t>
       </w:r>
       <w:bookmarkEnd w:id="70"/>
@@ -17386,13 +17383,12 @@
     </w:p>
     <w:p>
       <w:pPr>
-        <w:pStyle w:val="Titolo1"/>
+        <w:pStyle w:val="Heading1"/>
         <w:pageBreakBefore/>
       </w:pPr>
       <w:bookmarkStart w:id="72" w:name="_Toc243225298"/>
       <w:bookmarkStart w:id="73" w:name="_Toc243226383"/>
       <w:r>
-        <w:lastRenderedPageBreak/>
         <w:t>C4 Registro della costruzione 3</w:t>
       </w:r>
       <w:bookmarkEnd w:id="72"/>
@@ -17568,13 +17564,12 @@
     </w:p>
     <w:p>
       <w:pPr>
-        <w:pStyle w:val="Titolo1"/>
+        <w:pStyle w:val="Heading1"/>
         <w:pageBreakBefore/>
       </w:pPr>
       <w:bookmarkStart w:id="74" w:name="_Toc243225299"/>
       <w:bookmarkStart w:id="75" w:name="_Toc243226384"/>
       <w:r>
-        <w:lastRenderedPageBreak/>
         <w:t>D1 Tracciabilità e diagrammi</w:t>
       </w:r>
       <w:bookmarkEnd w:id="74"/>
@@ -17587,7 +17582,7 @@
     </w:p>
     <w:tbl>
       <w:tblPr>
-        <w:tblStyle w:val="Grigliatabella"/>
+        <w:tblStyle w:val="TableGrid"/>
         <w:tblW w:w="0" w:type="auto"/>
         <w:jc w:val="center"/>
         <w:tblBorders>
@@ -17753,7 +17748,7 @@
     </w:p>
     <w:p>
       <w:pPr>
-        <w:pStyle w:val="Titolo2"/>
+        <w:pStyle w:val="Heading2"/>
       </w:pPr>
       <w:r>
         <w:t>Registro dei diagrammi</w:t>
@@ -17761,7 +17756,7 @@
     </w:p>
     <w:tbl>
       <w:tblPr>
-        <w:tblStyle w:val="Grigliatabella"/>
+        <w:tblStyle w:val="TableGrid"/>
         <w:tblW w:w="0" w:type="auto"/>
         <w:jc w:val="center"/>
         <w:tblBorders>
@@ -18131,7 +18126,7 @@
     </w:p>
     <w:p>
       <w:pPr>
-        <w:pStyle w:val="Titolo2"/>
+        <w:pStyle w:val="Heading2"/>
       </w:pPr>
       <w:r>
         <w:t>Controllo di coerenza prima della review</w:t>
@@ -18149,13 +18144,12 @@
     </w:p>
     <w:p>
       <w:pPr>
-        <w:pStyle w:val="Titolo1"/>
+        <w:pStyle w:val="Heading1"/>
         <w:pageBreakBefore/>
       </w:pPr>
       <w:bookmarkStart w:id="76" w:name="_Toc243225300"/>
       <w:bookmarkStart w:id="77" w:name="_Toc243226385"/>
       <w:r>
-        <w:lastRenderedPageBreak/>
         <w:t>D2 Fonti e riferimenti</w:t>
       </w:r>
       <w:bookmarkEnd w:id="76"/>
@@ -18163,7 +18157,7 @@
     </w:p>
     <w:tbl>
       <w:tblPr>
-        <w:tblStyle w:val="Grigliatabella"/>
+        <w:tblStyle w:val="TableGrid"/>
         <w:tblW w:w="0" w:type="auto"/>
         <w:jc w:val="center"/>
         <w:tblBorders>
@@ -18464,7 +18458,7 @@
     </w:p>
     <w:p>
       <w:pPr>
-        <w:pStyle w:val="Titolo2"/>
+        <w:pStyle w:val="Heading2"/>
         <w:rPr>
           <w:lang w:val="en-US"/>
         </w:rPr>
@@ -18482,7 +18476,7 @@
           <w:lang w:val="en-US"/>
         </w:rPr>
       </w:pPr>
-      <w:hyperlink r:id="rId18">
+      <w:hyperlink r:id="rId19">
         <w:r>
           <w:rPr>
             <w:color w:val="31849B"/>
@@ -18499,7 +18493,7 @@
           <w:lang w:val="en-US"/>
         </w:rPr>
       </w:pPr>
-      <w:hyperlink r:id="rId19">
+      <w:hyperlink r:id="rId20">
         <w:r>
           <w:rPr>
             <w:color w:val="31849B"/>
@@ -18516,7 +18510,7 @@
           <w:lang w:val="en-US"/>
         </w:rPr>
       </w:pPr>
-      <w:hyperlink r:id="rId20">
+      <w:hyperlink r:id="rId21">
         <w:r>
           <w:rPr>
             <w:color w:val="31849B"/>
@@ -18533,7 +18527,7 @@
           <w:lang w:val="en-US"/>
         </w:rPr>
       </w:pPr>
-      <w:hyperlink r:id="rId21">
+      <w:hyperlink r:id="rId22">
         <w:r>
           <w:rPr>
             <w:color w:val="31849B"/>
@@ -18550,7 +18544,7 @@
           <w:lang w:val="en-US"/>
         </w:rPr>
       </w:pPr>
-      <w:hyperlink r:id="rId22">
+      <w:hyperlink r:id="rId23">
         <w:r>
           <w:rPr>
             <w:color w:val="31849B"/>
@@ -18563,7 +18557,7 @@
     </w:p>
     <w:p>
       <w:pPr>
-        <w:pStyle w:val="Titolo2"/>
+        <w:pStyle w:val="Heading2"/>
       </w:pPr>
       <w:r>
         <w:t>Aggiornamento delle fonti</w:t>
@@ -18587,7 +18581,7 @@
       <w:bookmarkEnd w:id="63"/>
     </w:p>
     <w:sectPr>
-      <w:footerReference w:type="default" r:id="rId23"/>
+      <w:footerReference w:type="default" r:id="rId24"/>
       <w:pgSz w:w="11900" w:h="16840"/>
       <w:pgMar w:top="1417" w:right="1134" w:bottom="1134" w:left="1134" w:header="708" w:footer="708" w:gutter="0"/>
       <w:pgNumType w:start="1"/>
@@ -18603,12 +18597,12 @@
   <w:comment w:id="6" w:author="ANTONIO CAPRIO" w:date="2026-10-18T19:37:00Z" w:initials="AC">
     <w:p>
       <w:pPr>
-        <w:pStyle w:val="Testocommento"/>
+        <w:pStyle w:val="CommentText"/>
         <w:jc w:val="left"/>
       </w:pPr>
       <w:r>
         <w:rPr>
-          <w:rStyle w:val="Rimandocommento"/>
+          <w:rStyle w:val="CommentReference"/>
         </w:rPr>
         <w:annotationRef/>
       </w:r>
@@ -18625,7 +18619,7 @@
       <w:bookmarkEnd w:id="7"/>
       <w:r>
         <w:rPr>
-          <w:rStyle w:val="Menzione"/>
+          <w:rStyle w:val="Mention"/>
           <w:noProof/>
         </w:rPr>
         <w:t>@GIOVANNI FRAGOLA</w:t>
@@ -18649,7 +18643,7 @@
       <w:bookmarkEnd w:id="8"/>
       <w:r>
         <w:rPr>
-          <w:rStyle w:val="Menzione"/>
+          <w:rStyle w:val="Mention"/>
           <w:noProof/>
         </w:rPr>
         <w:t>@ROBERTA GIOVENGO</w:t>
@@ -18673,7 +18667,7 @@
       <w:bookmarkEnd w:id="9"/>
       <w:r>
         <w:rPr>
-          <w:rStyle w:val="Menzione"/>
+          <w:rStyle w:val="Mention"/>
           <w:noProof/>
         </w:rPr>
         <w:t>@GIANLUCA CINQUEGRANA</w:t>
@@ -18689,12 +18683,12 @@
   <w:comment w:id="13" w:author="ANTONIO CAPRIO" w:date="2026-10-18T19:38:00Z" w:initials="AC">
     <w:p>
       <w:pPr>
-        <w:pStyle w:val="Testocommento"/>
+        <w:pStyle w:val="CommentText"/>
         <w:jc w:val="left"/>
       </w:pPr>
       <w:r>
         <w:rPr>
-          <w:rStyle w:val="Rimandocommento"/>
+          <w:rStyle w:val="CommentReference"/>
         </w:rPr>
         <w:annotationRef/>
       </w:r>
@@ -18711,7 +18705,7 @@
       <w:bookmarkEnd w:id="14"/>
       <w:r>
         <w:rPr>
-          <w:rStyle w:val="Menzione"/>
+          <w:rStyle w:val="Mention"/>
           <w:noProof/>
         </w:rPr>
         <w:t>@ALESSANDRO FONTANA</w:t>
@@ -18735,7 +18729,7 @@
       <w:bookmarkEnd w:id="15"/>
       <w:r>
         <w:rPr>
-          <w:rStyle w:val="Menzione"/>
+          <w:rStyle w:val="Mention"/>
           <w:noProof/>
         </w:rPr>
         <w:t>@MANUEL FORNATARO</w:t>
@@ -18751,12 +18745,12 @@
   <w:comment w:id="19" w:author="ANTONIO CAPRIO" w:date="2026-10-18T19:42:00Z" w:initials="AC">
     <w:p>
       <w:pPr>
-        <w:pStyle w:val="Testocommento"/>
+        <w:pStyle w:val="CommentText"/>
         <w:jc w:val="left"/>
       </w:pPr>
       <w:r>
         <w:rPr>
-          <w:rStyle w:val="Rimandocommento"/>
+          <w:rStyle w:val="CommentReference"/>
         </w:rPr>
         <w:annotationRef/>
       </w:r>
@@ -18773,7 +18767,7 @@
       <w:bookmarkEnd w:id="20"/>
       <w:r>
         <w:rPr>
-          <w:rStyle w:val="Menzione"/>
+          <w:rStyle w:val="Mention"/>
           <w:noProof/>
         </w:rPr>
         <w:t>@SALVATORE DI COSTANZO</w:t>
@@ -18797,7 +18791,7 @@
       <w:bookmarkEnd w:id="21"/>
       <w:r>
         <w:rPr>
-          <w:rStyle w:val="Menzione"/>
+          <w:rStyle w:val="Mention"/>
           <w:noProof/>
         </w:rPr>
         <w:t>@ANTONIO CAPRIO</w:t>
@@ -18863,7 +18857,7 @@
 <w:ftr xmlns:wpc="http://schemas.microsoft.com/office/word/2010/wordprocessingCanvas" xmlns:cx="http://schemas.microsoft.com/office/drawing/2014/chartex" xmlns:cx1="http://schemas.microsoft.com/office/drawing/2015/9/8/chartex" xmlns:cx2="http://schemas.microsoft.com/office/drawing/2015/10/21/chartex" xmlns:cx3="http://schemas.microsoft.com/office/drawing/2016/5/9/chartex" xmlns:cx4="http://schemas.microsoft.com/office/drawing/2016/5/10/chartex" xmlns:cx5="http://schemas.microsoft.com/office/drawing/2016/5/11/chartex" xmlns:cx6="http://schemas.microsoft.com/office/drawing/2016/5/12/chartex" xmlns:cx7="http://schemas.microsoft.com/office/drawing/2016/5/13/chartex" xmlns:cx8="http://schemas.microsoft.com/office/drawing/2016/5/14/chartex" xmlns:mc="http://schemas.openxmlformats.org/markup-compatibility/2006" xmlns:aink="http://schemas.microsoft.com/office/drawing/2016/ink" xmlns:am3d="http://schemas.microsoft.com/office/drawing/2017/model3d" xmlns:o="urn:schemas-microsoft-com:office:office" xmlns:oel="http://schemas.microsoft.com/office/2019/extlst" xmlns:r="http://schemas.openxmlformats.org/officeDocument/2006/relationships" xmlns:m="http://schemas.openxmlformats.org/officeDocument/2006/math" xmlns:v="urn:schemas-microsoft-com:vml" xmlns:wp14="http://schemas.microsoft.com/office/word/2010/wordprocessingDrawing" xmlns:wp="http://schemas.openxmlformats.org/drawingml/2006/wordprocessingDrawing" xmlns:w10="urn:schemas-microsoft-com:office:word" xmlns:w="http://schemas.openxmlformats.org/wordprocessingml/2006/main" xmlns:w14="http://schemas.microsoft.com/office/word/2010/wordml" xmlns:w15="http://schemas.microsoft.com/office/word/2012/wordml" xmlns:w16cex="http://schemas.microsoft.com/office/word/2018/wordml/cex" xmlns:w16cid="http://schemas.microsoft.com/office/word/2016/wordml/cid" xmlns:w16="http://schemas.microsoft.com/office/word/2018/wordml" xmlns:w16du="http://schemas.microsoft.com/office/word/2023/wordml/word16du" xmlns:w16sdtdh="http://schemas.microsoft.com/office/word/2020/wordml/sdtdatahash" xmlns:w16sdtfl="http://schemas.microsoft.com/office/word/2024/wordml/sdtformatlock" xmlns:w16se="http://schemas.microsoft.com/office/word/2015/wordml/symex" xmlns:wpg="http://schemas.microsoft.com/office/word/2010/wordprocessingGroup" xmlns:wpi="http://schemas.microsoft.com/office/word/2010/wordprocessingInk" xmlns:wne="http://schemas.microsoft.com/office/word/2006/wordml" xmlns:wps="http://schemas.microsoft.com/office/word/2010/wordprocessingShape" mc:Ignorable="w14 w15 w16se w16cid w16 w16cex w16sdtdh w16sdtfl w16du wp14">
   <w:p>
     <w:pPr>
-      <w:pStyle w:val="Pidipagina"/>
+      <w:pStyle w:val="Footer"/>
     </w:pPr>
     <w:r>
       <w:rPr>
@@ -18930,7 +18924,7 @@
             </wp:anchor>
           </w:drawing>
         </mc:Choice>
-        <mc:Fallback xmlns:arto="http://schemas.microsoft.com/office/word/2006/arto" xmlns:a="http://schemas.openxmlformats.org/drawingml/2006/main">
+        <mc:Fallback xmlns:a="http://schemas.openxmlformats.org/drawingml/2006/main" xmlns:arto="http://schemas.microsoft.com/office/word/2006/arto">
           <w:pict w14:anchorId="18182B30">
             <v:line id="Connettore 1 6" style="position:absolute;z-index:251659264;visibility:visible;mso-wrap-style:square;mso-width-percent:0;mso-height-percent:0;mso-wrap-distance-left:9pt;mso-wrap-distance-top:0;mso-wrap-distance-right:9pt;mso-wrap-distance-bottom:0;mso-position-horizontal:absolute;mso-position-horizontal-relative:text;mso-position-vertical:absolute;mso-position-vertical-relative:text;mso-width-percent:0;mso-height-percent:0;mso-width-relative:margin;mso-height-relative:margin" o:spid="_x0000_s1026" strokecolor="#31849b" strokeweight="1.5pt" from="-4.45pt,-2.35pt" to="483.7pt,-2.35pt" w14:anchorId="3D5DA729" o:gfxdata="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"/>
           </w:pict>
@@ -18952,7 +18946,7 @@
     <w:hyperlink r:id="rId1" w:history="1">
       <w:r>
         <w:rPr>
-          <w:rStyle w:val="Collegamentoipertestuale"/>
+          <w:rStyle w:val="Hyperlink"/>
           <w:color w:val="000000" w:themeColor="text1"/>
           <w:u w:val="none"/>
         </w:rPr>
@@ -18968,7 +18962,7 @@
   <w:sdt>
     <w:sdtPr>
       <w:rPr>
-        <w:rStyle w:val="Numeropagina"/>
+        <w:rStyle w:val="PageNumber"/>
       </w:rPr>
       <w:id w:val="-2069870238"/>
       <w:docPartObj>
@@ -18976,43 +18970,48 @@
         <w:docPartUnique/>
       </w:docPartObj>
     </w:sdtPr>
+    <w:sdtEndPr>
+      <w:rPr>
+        <w:rStyle w:val="PageNumber"/>
+      </w:rPr>
+    </w:sdtEndPr>
     <w:sdtContent>
       <w:p>
         <w:pPr>
-          <w:pStyle w:val="Pidipagina"/>
+          <w:pStyle w:val="Footer"/>
           <w:framePr w:wrap="none" w:vAnchor="text" w:hAnchor="page" w:x="11261" w:y="7"/>
           <w:rPr>
-            <w:rStyle w:val="Numeropagina"/>
+            <w:rStyle w:val="PageNumber"/>
           </w:rPr>
         </w:pPr>
         <w:r>
           <w:rPr>
-            <w:rStyle w:val="Numeropagina"/>
+            <w:rStyle w:val="PageNumber"/>
           </w:rPr>
           <w:fldChar w:fldCharType="begin"/>
         </w:r>
         <w:r>
           <w:rPr>
-            <w:rStyle w:val="Numeropagina"/>
+            <w:rStyle w:val="PageNumber"/>
           </w:rPr>
           <w:instrText xml:space="preserve"> PAGE </w:instrText>
         </w:r>
         <w:r>
           <w:rPr>
-            <w:rStyle w:val="Numeropagina"/>
+            <w:rStyle w:val="PageNumber"/>
           </w:rPr>
           <w:fldChar w:fldCharType="separate"/>
         </w:r>
         <w:r>
           <w:rPr>
-            <w:rStyle w:val="Numeropagina"/>
+            <w:rStyle w:val="PageNumber"/>
             <w:noProof/>
           </w:rPr>
           <w:t>1</w:t>
         </w:r>
         <w:r>
           <w:rPr>
-            <w:rStyle w:val="Numeropagina"/>
+            <w:rStyle w:val="PageNumber"/>
           </w:rPr>
           <w:fldChar w:fldCharType="end"/>
         </w:r>
@@ -19021,7 +19020,7 @@
   </w:sdt>
   <w:p>
     <w:pPr>
-      <w:pStyle w:val="Pidipagina"/>
+      <w:pStyle w:val="Footer"/>
     </w:pPr>
     <w:r>
       <w:rPr>
@@ -19174,7 +19173,7 @@
     <w:hyperlink r:id="rId3" w:history="1">
       <w:r>
         <w:rPr>
-          <w:rStyle w:val="Collegamentoipertestuale"/>
+          <w:rStyle w:val="Hyperlink"/>
           <w:color w:val="000000" w:themeColor="text1"/>
           <w:u w:val="none"/>
         </w:rPr>
@@ -30555,7 +30554,7 @@
     <w:lsdException w:name="Unresolved Mention" w:semiHidden="1" w:unhideWhenUsed="1"/>
     <w:lsdException w:name="Smart Link" w:semiHidden="1" w:unhideWhenUsed="1"/>
   </w:latentStyles>
-  <w:style w:type="paragraph" w:default="1" w:styleId="Normale">
+  <w:style w:type="paragraph" w:default="1" w:styleId="Normal">
     <w:name w:val="Normal"/>
     <w:qFormat/>
     <w:rsid w:val="005D3C99"/>
@@ -30564,12 +30563,12 @@
       <w:jc w:val="both"/>
     </w:pPr>
   </w:style>
-  <w:style w:type="paragraph" w:styleId="Titolo1">
+  <w:style w:type="paragraph" w:styleId="Heading1">
     <w:name w:val="heading 1"/>
     <w:aliases w:val="Titre principal,T1,T11,T12,1 ghost,g,ghost,head:1#,Head 1,Head 11,head:1#1,Head 12,head:1#2,Head 111,head:1#11,Head 13,head:1#3,Head 112,head:1#12"/>
-    <w:basedOn w:val="Normale"/>
-    <w:next w:val="Normale"/>
-    <w:link w:val="Titolo1Carattere"/>
+    <w:basedOn w:val="Normal"/>
+    <w:next w:val="Normal"/>
+    <w:link w:val="Heading1Char"/>
     <w:uiPriority w:val="9"/>
     <w:qFormat/>
     <w:rsid w:val="00DB3FD2"/>
@@ -30589,11 +30588,11 @@
       <w:szCs w:val="28"/>
     </w:rPr>
   </w:style>
-  <w:style w:type="paragraph" w:styleId="Titolo2">
+  <w:style w:type="paragraph" w:styleId="Heading2">
     <w:name w:val="heading 2"/>
-    <w:basedOn w:val="Normale"/>
-    <w:next w:val="Normale"/>
-    <w:link w:val="Titolo2Carattere"/>
+    <w:basedOn w:val="Normal"/>
+    <w:next w:val="Normal"/>
+    <w:link w:val="Heading2Char"/>
     <w:autoRedefine/>
     <w:qFormat/>
     <w:rsid w:val="00DB3FD2"/>
@@ -30614,11 +30613,11 @@
       <w:szCs w:val="26"/>
     </w:rPr>
   </w:style>
-  <w:style w:type="paragraph" w:styleId="Titolo3">
+  <w:style w:type="paragraph" w:styleId="Heading3">
     <w:name w:val="heading 3"/>
-    <w:basedOn w:val="Normale"/>
-    <w:next w:val="Normale"/>
-    <w:link w:val="Titolo3Carattere"/>
+    <w:basedOn w:val="Normal"/>
+    <w:next w:val="Normal"/>
+    <w:link w:val="Heading3Char"/>
     <w:uiPriority w:val="9"/>
     <w:unhideWhenUsed/>
     <w:qFormat/>
@@ -30638,11 +30637,11 @@
       <w:sz w:val="26"/>
     </w:rPr>
   </w:style>
-  <w:style w:type="paragraph" w:styleId="Titolo4">
+  <w:style w:type="paragraph" w:styleId="Heading4">
     <w:name w:val="heading 4"/>
-    <w:basedOn w:val="Titolo3"/>
-    <w:next w:val="Normale"/>
-    <w:link w:val="Titolo4Carattere"/>
+    <w:basedOn w:val="Heading3"/>
+    <w:next w:val="Normal"/>
+    <w:link w:val="Heading4Char"/>
     <w:rsid w:val="006304CD"/>
     <w:pPr>
       <w:pBdr>
@@ -30657,11 +30656,11 @@
       <w:iCs/>
     </w:rPr>
   </w:style>
-  <w:style w:type="paragraph" w:styleId="Titolo5">
+  <w:style w:type="paragraph" w:styleId="Heading5">
     <w:name w:val="heading 5"/>
-    <w:basedOn w:val="Normale"/>
-    <w:next w:val="Normale"/>
-    <w:link w:val="Titolo5Carattere"/>
+    <w:basedOn w:val="Normal"/>
+    <w:next w:val="Normal"/>
+    <w:link w:val="Heading5Char"/>
     <w:uiPriority w:val="9"/>
     <w:unhideWhenUsed/>
     <w:qFormat/>
@@ -30677,13 +30676,12 @@
       <w:color w:val="31849B"/>
     </w:rPr>
   </w:style>
-  <w:style w:type="character" w:default="1" w:styleId="Carpredefinitoparagrafo">
+  <w:style w:type="character" w:default="1" w:styleId="DefaultParagraphFont">
     <w:name w:val="Default Paragraph Font"/>
     <w:uiPriority w:val="1"/>
-    <w:semiHidden/>
     <w:unhideWhenUsed/>
   </w:style>
-  <w:style w:type="table" w:default="1" w:styleId="Tabellanormale">
+  <w:style w:type="table" w:default="1" w:styleId="TableNormal">
     <w:name w:val="Normal Table"/>
     <w:uiPriority w:val="99"/>
     <w:semiHidden/>
@@ -30698,16 +30696,16 @@
       </w:tblCellMar>
     </w:tblPr>
   </w:style>
-  <w:style w:type="numbering" w:default="1" w:styleId="Nessunelenco">
+  <w:style w:type="numbering" w:default="1" w:styleId="NoList">
     <w:name w:val="No List"/>
     <w:uiPriority w:val="99"/>
     <w:semiHidden/>
     <w:unhideWhenUsed/>
   </w:style>
-  <w:style w:type="paragraph" w:styleId="Sommario2">
+  <w:style w:type="paragraph" w:styleId="TOC2">
     <w:name w:val="toc 2"/>
-    <w:basedOn w:val="Normale"/>
-    <w:next w:val="Normale"/>
+    <w:basedOn w:val="Normal"/>
+    <w:next w:val="Normal"/>
     <w:autoRedefine/>
     <w:uiPriority w:val="39"/>
     <w:qFormat/>
@@ -30722,10 +30720,10 @@
       <w:szCs w:val="20"/>
     </w:rPr>
   </w:style>
-  <w:style w:type="paragraph" w:styleId="Sommario3">
+  <w:style w:type="paragraph" w:styleId="TOC3">
     <w:name w:val="toc 3"/>
-    <w:basedOn w:val="Normale"/>
-    <w:next w:val="Normale"/>
+    <w:basedOn w:val="Normal"/>
+    <w:next w:val="Normal"/>
     <w:autoRedefine/>
     <w:uiPriority w:val="39"/>
     <w:rsid w:val="00382F91"/>
@@ -30739,10 +30737,10 @@
       <w:szCs w:val="20"/>
     </w:rPr>
   </w:style>
-  <w:style w:type="paragraph" w:styleId="Sommario4">
+  <w:style w:type="paragraph" w:styleId="TOC4">
     <w:name w:val="toc 4"/>
-    <w:basedOn w:val="Normale"/>
-    <w:next w:val="Normale"/>
+    <w:basedOn w:val="Normal"/>
+    <w:next w:val="Normal"/>
     <w:uiPriority w:val="39"/>
     <w:rsid w:val="00405AA0"/>
     <w:pPr>
@@ -30753,10 +30751,10 @@
       <w:szCs w:val="18"/>
     </w:rPr>
   </w:style>
-  <w:style w:type="paragraph" w:styleId="Sommario5">
+  <w:style w:type="paragraph" w:styleId="TOC5">
     <w:name w:val="toc 5"/>
-    <w:basedOn w:val="Normale"/>
-    <w:next w:val="Normale"/>
+    <w:basedOn w:val="Normal"/>
+    <w:next w:val="Normal"/>
     <w:uiPriority w:val="39"/>
     <w:rsid w:val="00405AA0"/>
     <w:pPr>
@@ -30767,10 +30765,10 @@
       <w:szCs w:val="18"/>
     </w:rPr>
   </w:style>
-  <w:style w:type="character" w:customStyle="1" w:styleId="Titolo4Carattere">
-    <w:name w:val="Titolo 4 Carattere"/>
-    <w:basedOn w:val="Carpredefinitoparagrafo"/>
-    <w:link w:val="Titolo4"/>
+  <w:style w:type="character" w:customStyle="1" w:styleId="Heading4Char">
+    <w:name w:val="Heading 4 Char"/>
+    <w:basedOn w:val="DefaultParagraphFont"/>
+    <w:link w:val="Heading4"/>
     <w:rsid w:val="006304CD"/>
     <w:rPr>
       <w:rFonts w:eastAsiaTheme="majorEastAsia" w:cstheme="majorBidi"/>
@@ -30783,10 +30781,10 @@
       <w:shd w:val="clear" w:color="659FD5" w:fill="auto"/>
     </w:rPr>
   </w:style>
-  <w:style w:type="character" w:customStyle="1" w:styleId="Titolo3Carattere">
-    <w:name w:val="Titolo 3 Carattere"/>
-    <w:basedOn w:val="Carpredefinitoparagrafo"/>
-    <w:link w:val="Titolo3"/>
+  <w:style w:type="character" w:customStyle="1" w:styleId="Heading3Char">
+    <w:name w:val="Heading 3 Char"/>
+    <w:basedOn w:val="DefaultParagraphFont"/>
+    <w:link w:val="Heading3"/>
     <w:uiPriority w:val="9"/>
     <w:rsid w:val="007F00F1"/>
     <w:rPr>
@@ -30798,11 +30796,11 @@
       <w:shd w:val="clear" w:color="659FD5" w:fill="DAEBF7"/>
     </w:rPr>
   </w:style>
-  <w:style w:type="character" w:customStyle="1" w:styleId="Titolo1Carattere">
-    <w:name w:val="Titolo 1 Carattere"/>
-    <w:aliases w:val="Titre principal Carattere,T1 Carattere,T11 Carattere,T12 Carattere,1 ghost Carattere,g Carattere,ghost Carattere,head:1# Carattere,Head 1 Carattere,Head 11 Carattere,head:1#1 Carattere,Head 12 Carattere,head:1#2 Carattere"/>
-    <w:basedOn w:val="Carpredefinitoparagrafo"/>
-    <w:link w:val="Titolo1"/>
+  <w:style w:type="character" w:customStyle="1" w:styleId="Heading1Char">
+    <w:name w:val="Heading 1 Char"/>
+    <w:aliases w:val="Titre principal Char,T1 Char,T11 Char,T12 Char,1 ghost Char,g Char,ghost Char,head:1# Char,Head 1 Char,Head 11 Char,head:1#1 Char,Head 12 Char,head:1#2 Char,Head 111 Char,head:1#11 Char,Head 13 Char,head:1#3 Char,Head 112 Char"/>
+    <w:basedOn w:val="DefaultParagraphFont"/>
+    <w:link w:val="Heading1"/>
     <w:uiPriority w:val="9"/>
     <w:rsid w:val="00DB3FD2"/>
     <w:rPr>
@@ -30812,10 +30810,10 @@
       <w:szCs w:val="28"/>
     </w:rPr>
   </w:style>
-  <w:style w:type="paragraph" w:styleId="Sommario1">
+  <w:style w:type="paragraph" w:styleId="TOC1">
     <w:name w:val="toc 1"/>
-    <w:basedOn w:val="Normale"/>
-    <w:next w:val="Normale"/>
+    <w:basedOn w:val="Normal"/>
+    <w:next w:val="Normal"/>
     <w:autoRedefine/>
     <w:uiPriority w:val="39"/>
     <w:rsid w:val="00B159C3"/>
@@ -30830,10 +30828,10 @@
       <w:szCs w:val="20"/>
     </w:rPr>
   </w:style>
-  <w:style w:type="character" w:customStyle="1" w:styleId="Titolo2Carattere">
-    <w:name w:val="Titolo 2 Carattere"/>
-    <w:basedOn w:val="Carpredefinitoparagrafo"/>
-    <w:link w:val="Titolo2"/>
+  <w:style w:type="character" w:customStyle="1" w:styleId="Heading2Char">
+    <w:name w:val="Heading 2 Char"/>
+    <w:basedOn w:val="DefaultParagraphFont"/>
+    <w:link w:val="Heading2"/>
     <w:rsid w:val="00DB3FD2"/>
     <w:rPr>
       <w:rFonts w:eastAsia="Calibri"/>
@@ -30843,10 +30841,10 @@
       <w:szCs w:val="26"/>
     </w:rPr>
   </w:style>
-  <w:style w:type="paragraph" w:styleId="Testofumetto">
+  <w:style w:type="paragraph" w:styleId="BalloonText">
     <w:name w:val="Balloon Text"/>
-    <w:basedOn w:val="Normale"/>
-    <w:link w:val="TestofumettoCarattere"/>
+    <w:basedOn w:val="Normal"/>
+    <w:link w:val="BalloonTextChar"/>
     <w:uiPriority w:val="99"/>
     <w:semiHidden/>
     <w:unhideWhenUsed/>
@@ -30857,10 +30855,10 @@
       <w:szCs w:val="18"/>
     </w:rPr>
   </w:style>
-  <w:style w:type="character" w:customStyle="1" w:styleId="TestofumettoCarattere">
-    <w:name w:val="Testo fumetto Carattere"/>
-    <w:basedOn w:val="Carpredefinitoparagrafo"/>
-    <w:link w:val="Testofumetto"/>
+  <w:style w:type="character" w:customStyle="1" w:styleId="BalloonTextChar">
+    <w:name w:val="Balloon Text Char"/>
+    <w:basedOn w:val="DefaultParagraphFont"/>
+    <w:link w:val="BalloonText"/>
     <w:uiPriority w:val="99"/>
     <w:semiHidden/>
     <w:rsid w:val="00936DB3"/>
@@ -30870,10 +30868,10 @@
       <w:szCs w:val="18"/>
     </w:rPr>
   </w:style>
-  <w:style w:type="paragraph" w:styleId="Intestazione">
+  <w:style w:type="paragraph" w:styleId="Header">
     <w:name w:val="header"/>
-    <w:basedOn w:val="Normale"/>
-    <w:link w:val="IntestazioneCarattere"/>
+    <w:basedOn w:val="Normal"/>
+    <w:link w:val="HeaderChar"/>
     <w:uiPriority w:val="99"/>
     <w:unhideWhenUsed/>
     <w:rsid w:val="00936DB3"/>
@@ -30884,17 +30882,17 @@
       </w:tabs>
     </w:pPr>
   </w:style>
-  <w:style w:type="character" w:customStyle="1" w:styleId="IntestazioneCarattere">
-    <w:name w:val="Intestazione Carattere"/>
-    <w:basedOn w:val="Carpredefinitoparagrafo"/>
-    <w:link w:val="Intestazione"/>
+  <w:style w:type="character" w:customStyle="1" w:styleId="HeaderChar">
+    <w:name w:val="Header Char"/>
+    <w:basedOn w:val="DefaultParagraphFont"/>
+    <w:link w:val="Header"/>
     <w:uiPriority w:val="99"/>
     <w:rsid w:val="00936DB3"/>
   </w:style>
-  <w:style w:type="paragraph" w:styleId="Pidipagina">
+  <w:style w:type="paragraph" w:styleId="Footer">
     <w:name w:val="footer"/>
-    <w:basedOn w:val="Normale"/>
-    <w:link w:val="PidipaginaCarattere"/>
+    <w:basedOn w:val="Normal"/>
+    <w:link w:val="FooterChar"/>
     <w:uiPriority w:val="99"/>
     <w:unhideWhenUsed/>
     <w:rsid w:val="00936DB3"/>
@@ -30905,17 +30903,17 @@
       </w:tabs>
     </w:pPr>
   </w:style>
-  <w:style w:type="character" w:customStyle="1" w:styleId="PidipaginaCarattere">
-    <w:name w:val="Piè di pagina Carattere"/>
-    <w:basedOn w:val="Carpredefinitoparagrafo"/>
-    <w:link w:val="Pidipagina"/>
+  <w:style w:type="character" w:customStyle="1" w:styleId="FooterChar">
+    <w:name w:val="Footer Char"/>
+    <w:basedOn w:val="DefaultParagraphFont"/>
+    <w:link w:val="Footer"/>
     <w:uiPriority w:val="99"/>
     <w:rsid w:val="00936DB3"/>
   </w:style>
-  <w:style w:type="paragraph" w:styleId="Sommario6">
+  <w:style w:type="paragraph" w:styleId="TOC6">
     <w:name w:val="toc 6"/>
-    <w:basedOn w:val="Normale"/>
-    <w:next w:val="Normale"/>
+    <w:basedOn w:val="Normal"/>
+    <w:next w:val="Normal"/>
     <w:autoRedefine/>
     <w:uiPriority w:val="39"/>
     <w:unhideWhenUsed/>
@@ -30928,10 +30926,10 @@
       <w:szCs w:val="18"/>
     </w:rPr>
   </w:style>
-  <w:style w:type="paragraph" w:styleId="Sommario7">
+  <w:style w:type="paragraph" w:styleId="TOC7">
     <w:name w:val="toc 7"/>
-    <w:basedOn w:val="Normale"/>
-    <w:next w:val="Normale"/>
+    <w:basedOn w:val="Normal"/>
+    <w:next w:val="Normal"/>
     <w:autoRedefine/>
     <w:uiPriority w:val="39"/>
     <w:unhideWhenUsed/>
@@ -30944,10 +30942,10 @@
       <w:szCs w:val="18"/>
     </w:rPr>
   </w:style>
-  <w:style w:type="paragraph" w:styleId="Sommario8">
+  <w:style w:type="paragraph" w:styleId="TOC8">
     <w:name w:val="toc 8"/>
-    <w:basedOn w:val="Normale"/>
-    <w:next w:val="Normale"/>
+    <w:basedOn w:val="Normal"/>
+    <w:next w:val="Normal"/>
     <w:autoRedefine/>
     <w:uiPriority w:val="39"/>
     <w:unhideWhenUsed/>
@@ -30960,10 +30958,10 @@
       <w:szCs w:val="18"/>
     </w:rPr>
   </w:style>
-  <w:style w:type="paragraph" w:styleId="Sommario9">
+  <w:style w:type="paragraph" w:styleId="TOC9">
     <w:name w:val="toc 9"/>
-    <w:basedOn w:val="Normale"/>
-    <w:next w:val="Normale"/>
+    <w:basedOn w:val="Normal"/>
+    <w:next w:val="Normal"/>
     <w:autoRedefine/>
     <w:uiPriority w:val="39"/>
     <w:unhideWhenUsed/>
@@ -30976,9 +30974,9 @@
       <w:szCs w:val="18"/>
     </w:rPr>
   </w:style>
-  <w:style w:type="paragraph" w:styleId="Paragrafoelenco">
+  <w:style w:type="paragraph" w:styleId="ListParagraph">
     <w:name w:val="List Paragraph"/>
-    <w:basedOn w:val="Normale"/>
+    <w:basedOn w:val="Normal"/>
     <w:uiPriority w:val="34"/>
     <w:qFormat/>
     <w:rsid w:val="006D0B6A"/>
@@ -30987,9 +30985,9 @@
       <w:contextualSpacing/>
     </w:pPr>
   </w:style>
-  <w:style w:type="table" w:styleId="Grigliatabella">
+  <w:style w:type="table" w:styleId="TableGrid">
     <w:name w:val="Table Grid"/>
-    <w:basedOn w:val="Tabellanormale"/>
+    <w:basedOn w:val="TableNormal"/>
     <w:uiPriority w:val="39"/>
     <w:rsid w:val="00C96682"/>
     <w:rPr>
@@ -31007,9 +31005,9 @@
       </w:tblBorders>
     </w:tblPr>
   </w:style>
-  <w:style w:type="character" w:styleId="Numeropagina">
+  <w:style w:type="character" w:styleId="PageNumber">
     <w:name w:val="page number"/>
-    <w:basedOn w:val="Carpredefinitoparagrafo"/>
+    <w:basedOn w:val="DefaultParagraphFont"/>
     <w:uiPriority w:val="99"/>
     <w:semiHidden/>
     <w:unhideWhenUsed/>
@@ -31017,7 +31015,7 @@
   </w:style>
   <w:style w:type="table" w:customStyle="1" w:styleId="Tabellasemplice-21">
     <w:name w:val="Tabella semplice - 21"/>
-    <w:basedOn w:val="Tabellanormale"/>
+    <w:basedOn w:val="TableNormal"/>
     <w:uiPriority w:val="42"/>
     <w:rsid w:val="004D4C72"/>
     <w:rPr>
@@ -31100,7 +31098,7 @@
   </w:style>
   <w:style w:type="table" w:customStyle="1" w:styleId="Elencotab31">
     <w:name w:val="Elenco tab. 31"/>
-    <w:basedOn w:val="Tabellanormale"/>
+    <w:basedOn w:val="TableNormal"/>
     <w:uiPriority w:val="48"/>
     <w:rsid w:val="00C256C9"/>
     <w:rPr>
@@ -31227,7 +31225,7 @@
   </w:style>
   <w:style w:type="table" w:customStyle="1" w:styleId="Tabellasemplice41">
     <w:name w:val="Tabella semplice 41"/>
-    <w:basedOn w:val="Tabellanormale"/>
+    <w:basedOn w:val="TableNormal"/>
     <w:uiPriority w:val="44"/>
     <w:rsid w:val="00F34D2F"/>
     <w:rPr>
@@ -31277,9 +31275,9 @@
       </w:tcPr>
     </w:tblStylePr>
   </w:style>
-  <w:style w:type="paragraph" w:styleId="NormaleWeb">
+  <w:style w:type="paragraph" w:styleId="NormalWeb">
     <w:name w:val="Normal (Web)"/>
-    <w:basedOn w:val="Normale"/>
+    <w:basedOn w:val="Normal"/>
     <w:uiPriority w:val="99"/>
     <w:unhideWhenUsed/>
     <w:rsid w:val="00C6111A"/>
@@ -31290,10 +31288,10 @@
       <w:rFonts w:ascii="Times New Roman" w:eastAsia="Times New Roman" w:hAnsi="Times New Roman" w:cs="Times New Roman"/>
     </w:rPr>
   </w:style>
-  <w:style w:type="paragraph" w:styleId="Titolosommario">
+  <w:style w:type="paragraph" w:styleId="TOCHeading">
     <w:name w:val="TOC Heading"/>
-    <w:basedOn w:val="Titolo1"/>
-    <w:next w:val="Normale"/>
+    <w:basedOn w:val="Heading1"/>
+    <w:next w:val="Normal"/>
     <w:uiPriority w:val="39"/>
     <w:unhideWhenUsed/>
     <w:qFormat/>
@@ -31310,10 +31308,10 @@
       <w:sz w:val="28"/>
     </w:rPr>
   </w:style>
-  <w:style w:type="paragraph" w:styleId="Indice3">
+  <w:style w:type="paragraph" w:styleId="Index3">
     <w:name w:val="index 3"/>
-    <w:basedOn w:val="Normale"/>
-    <w:next w:val="Normale"/>
+    <w:basedOn w:val="Normal"/>
+    <w:next w:val="Normal"/>
     <w:autoRedefine/>
     <w:uiPriority w:val="99"/>
     <w:unhideWhenUsed/>
@@ -31322,10 +31320,10 @@
       <w:ind w:left="720" w:hanging="240"/>
     </w:pPr>
   </w:style>
-  <w:style w:type="paragraph" w:styleId="Indice1">
+  <w:style w:type="paragraph" w:styleId="Index1">
     <w:name w:val="index 1"/>
-    <w:basedOn w:val="Normale"/>
-    <w:next w:val="Normale"/>
+    <w:basedOn w:val="Normal"/>
+    <w:next w:val="Normal"/>
     <w:autoRedefine/>
     <w:uiPriority w:val="99"/>
     <w:unhideWhenUsed/>
@@ -31334,10 +31332,10 @@
       <w:ind w:left="240" w:hanging="240"/>
     </w:pPr>
   </w:style>
-  <w:style w:type="paragraph" w:styleId="Indice2">
+  <w:style w:type="paragraph" w:styleId="Index2">
     <w:name w:val="index 2"/>
-    <w:basedOn w:val="Normale"/>
-    <w:next w:val="Normale"/>
+    <w:basedOn w:val="Normal"/>
+    <w:next w:val="Normal"/>
     <w:autoRedefine/>
     <w:uiPriority w:val="99"/>
     <w:unhideWhenUsed/>
@@ -31346,10 +31344,10 @@
       <w:ind w:left="480" w:hanging="240"/>
     </w:pPr>
   </w:style>
-  <w:style w:type="paragraph" w:styleId="Indice4">
+  <w:style w:type="paragraph" w:styleId="Index4">
     <w:name w:val="index 4"/>
-    <w:basedOn w:val="Normale"/>
-    <w:next w:val="Normale"/>
+    <w:basedOn w:val="Normal"/>
+    <w:next w:val="Normal"/>
     <w:autoRedefine/>
     <w:uiPriority w:val="99"/>
     <w:unhideWhenUsed/>
@@ -31358,10 +31356,10 @@
       <w:ind w:left="960" w:hanging="240"/>
     </w:pPr>
   </w:style>
-  <w:style w:type="paragraph" w:styleId="Indice5">
+  <w:style w:type="paragraph" w:styleId="Index5">
     <w:name w:val="index 5"/>
-    <w:basedOn w:val="Normale"/>
-    <w:next w:val="Normale"/>
+    <w:basedOn w:val="Normal"/>
+    <w:next w:val="Normal"/>
     <w:autoRedefine/>
     <w:uiPriority w:val="99"/>
     <w:unhideWhenUsed/>
@@ -31370,10 +31368,10 @@
       <w:ind w:left="1200" w:hanging="240"/>
     </w:pPr>
   </w:style>
-  <w:style w:type="paragraph" w:styleId="Indice6">
+  <w:style w:type="paragraph" w:styleId="Index6">
     <w:name w:val="index 6"/>
-    <w:basedOn w:val="Normale"/>
-    <w:next w:val="Normale"/>
+    <w:basedOn w:val="Normal"/>
+    <w:next w:val="Normal"/>
     <w:autoRedefine/>
     <w:uiPriority w:val="99"/>
     <w:unhideWhenUsed/>
@@ -31382,10 +31380,10 @@
       <w:ind w:left="1440" w:hanging="240"/>
     </w:pPr>
   </w:style>
-  <w:style w:type="paragraph" w:styleId="Indice7">
+  <w:style w:type="paragraph" w:styleId="Index7">
     <w:name w:val="index 7"/>
-    <w:basedOn w:val="Normale"/>
-    <w:next w:val="Normale"/>
+    <w:basedOn w:val="Normal"/>
+    <w:next w:val="Normal"/>
     <w:autoRedefine/>
     <w:uiPriority w:val="99"/>
     <w:unhideWhenUsed/>
@@ -31394,10 +31392,10 @@
       <w:ind w:left="1680" w:hanging="240"/>
     </w:pPr>
   </w:style>
-  <w:style w:type="paragraph" w:styleId="Indice8">
+  <w:style w:type="paragraph" w:styleId="Index8">
     <w:name w:val="index 8"/>
-    <w:basedOn w:val="Normale"/>
-    <w:next w:val="Normale"/>
+    <w:basedOn w:val="Normal"/>
+    <w:next w:val="Normal"/>
     <w:autoRedefine/>
     <w:uiPriority w:val="99"/>
     <w:unhideWhenUsed/>
@@ -31406,10 +31404,10 @@
       <w:ind w:left="1920" w:hanging="240"/>
     </w:pPr>
   </w:style>
-  <w:style w:type="paragraph" w:styleId="Indice9">
+  <w:style w:type="paragraph" w:styleId="Index9">
     <w:name w:val="index 9"/>
-    <w:basedOn w:val="Normale"/>
-    <w:next w:val="Normale"/>
+    <w:basedOn w:val="Normal"/>
+    <w:next w:val="Normal"/>
     <w:autoRedefine/>
     <w:uiPriority w:val="99"/>
     <w:unhideWhenUsed/>
@@ -31418,17 +31416,17 @@
       <w:ind w:left="2160" w:hanging="240"/>
     </w:pPr>
   </w:style>
-  <w:style w:type="paragraph" w:styleId="Titoloindice">
+  <w:style w:type="paragraph" w:styleId="IndexHeading">
     <w:name w:val="index heading"/>
-    <w:basedOn w:val="Normale"/>
-    <w:next w:val="Indice1"/>
+    <w:basedOn w:val="Normal"/>
+    <w:next w:val="Index1"/>
     <w:uiPriority w:val="99"/>
     <w:unhideWhenUsed/>
     <w:rsid w:val="00382F91"/>
   </w:style>
   <w:style w:type="table" w:customStyle="1" w:styleId="Tabellaelenco6acolori1">
     <w:name w:val="Tabella elenco 6 a colori1"/>
-    <w:basedOn w:val="Tabellanormale"/>
+    <w:basedOn w:val="TableNormal"/>
     <w:uiPriority w:val="51"/>
     <w:rsid w:val="003B3DBC"/>
     <w:rPr>
@@ -31495,9 +31493,9 @@
       </w:tcPr>
     </w:tblStylePr>
   </w:style>
-  <w:style w:type="character" w:styleId="Collegamentoipertestuale">
+  <w:style w:type="character" w:styleId="Hyperlink">
     <w:name w:val="Hyperlink"/>
-    <w:basedOn w:val="Carpredefinitoparagrafo"/>
+    <w:basedOn w:val="DefaultParagraphFont"/>
     <w:uiPriority w:val="99"/>
     <w:unhideWhenUsed/>
     <w:rsid w:val="000218A3"/>
@@ -31508,7 +31506,7 @@
   </w:style>
   <w:style w:type="character" w:customStyle="1" w:styleId="Menzionenonrisolta1">
     <w:name w:val="Menzione non risolta1"/>
-    <w:basedOn w:val="Carpredefinitoparagrafo"/>
+    <w:basedOn w:val="DefaultParagraphFont"/>
     <w:uiPriority w:val="99"/>
     <w:semiHidden/>
     <w:unhideWhenUsed/>
@@ -31518,9 +31516,9 @@
       <w:shd w:val="clear" w:color="auto" w:fill="E1DFDD"/>
     </w:rPr>
   </w:style>
-  <w:style w:type="character" w:styleId="Collegamentovisitato">
+  <w:style w:type="character" w:styleId="FollowedHyperlink">
     <w:name w:val="FollowedHyperlink"/>
-    <w:basedOn w:val="Carpredefinitoparagrafo"/>
+    <w:basedOn w:val="DefaultParagraphFont"/>
     <w:uiPriority w:val="99"/>
     <w:semiHidden/>
     <w:unhideWhenUsed/>
@@ -31570,9 +31568,9 @@
       </w:numPr>
     </w:pPr>
   </w:style>
-  <w:style w:type="character" w:styleId="Menzionenonrisolta">
+  <w:style w:type="character" w:styleId="UnresolvedMention">
     <w:name w:val="Unresolved Mention"/>
-    <w:basedOn w:val="Carpredefinitoparagrafo"/>
+    <w:basedOn w:val="DefaultParagraphFont"/>
     <w:uiPriority w:val="99"/>
     <w:semiHidden/>
     <w:unhideWhenUsed/>
@@ -31682,7 +31680,7 @@
       </w:numPr>
     </w:pPr>
   </w:style>
-  <w:style w:type="paragraph" w:styleId="Nessunaspaziatura">
+  <w:style w:type="paragraph" w:styleId="NoSpacing">
     <w:name w:val="No Spacing"/>
     <w:uiPriority w:val="1"/>
     <w:qFormat/>
@@ -31948,10 +31946,10 @@
       </w:numPr>
     </w:pPr>
   </w:style>
-  <w:style w:type="character" w:customStyle="1" w:styleId="Titolo5Carattere">
-    <w:name w:val="Titolo 5 Carattere"/>
-    <w:basedOn w:val="Carpredefinitoparagrafo"/>
-    <w:link w:val="Titolo5"/>
+  <w:style w:type="character" w:customStyle="1" w:styleId="Heading5Char">
+    <w:name w:val="Heading 5 Char"/>
+    <w:basedOn w:val="DefaultParagraphFont"/>
+    <w:link w:val="Heading5"/>
     <w:uiPriority w:val="9"/>
     <w:rsid w:val="005F7342"/>
     <w:rPr>
@@ -31959,10 +31957,10 @@
       <w:color w:val="365F91" w:themeColor="accent1" w:themeShade="BF"/>
     </w:rPr>
   </w:style>
-  <w:style w:type="paragraph" w:styleId="Didascalia">
+  <w:style w:type="paragraph" w:styleId="Caption">
     <w:name w:val="caption"/>
-    <w:basedOn w:val="Normale"/>
-    <w:next w:val="Normale"/>
+    <w:basedOn w:val="Normal"/>
+    <w:next w:val="Normal"/>
     <w:uiPriority w:val="35"/>
     <w:unhideWhenUsed/>
     <w:qFormat/>
@@ -31998,7 +31996,7 @@
       </w:numPr>
     </w:pPr>
   </w:style>
-  <w:style w:type="paragraph" w:customStyle="1" w:styleId="Titolo10">
+  <w:style w:type="paragraph" w:customStyle="1" w:styleId="Titolo1">
     <w:name w:val="Titolo1"/>
     <w:pPr>
       <w:spacing w:after="200"/>
@@ -32011,9 +32009,9 @@
       <w:sz w:val="48"/>
     </w:rPr>
   </w:style>
-  <w:style w:type="character" w:styleId="Rimandocommento">
+  <w:style w:type="character" w:styleId="CommentReference">
     <w:name w:val="annotation reference"/>
-    <w:basedOn w:val="Carpredefinitoparagrafo"/>
+    <w:basedOn w:val="DefaultParagraphFont"/>
     <w:uiPriority w:val="99"/>
     <w:semiHidden/>
     <w:unhideWhenUsed/>
@@ -32023,10 +32021,10 @@
       <w:szCs w:val="16"/>
     </w:rPr>
   </w:style>
-  <w:style w:type="paragraph" w:styleId="Testocommento">
+  <w:style w:type="paragraph" w:styleId="CommentText">
     <w:name w:val="annotation text"/>
-    <w:basedOn w:val="Normale"/>
-    <w:link w:val="TestocommentoCarattere"/>
+    <w:basedOn w:val="Normal"/>
+    <w:link w:val="CommentTextChar"/>
     <w:uiPriority w:val="99"/>
     <w:unhideWhenUsed/>
     <w:rsid w:val="00096872"/>
@@ -32035,10 +32033,10 @@
       <w:szCs w:val="20"/>
     </w:rPr>
   </w:style>
-  <w:style w:type="character" w:customStyle="1" w:styleId="TestocommentoCarattere">
-    <w:name w:val="Testo commento Carattere"/>
-    <w:basedOn w:val="Carpredefinitoparagrafo"/>
-    <w:link w:val="Testocommento"/>
+  <w:style w:type="character" w:customStyle="1" w:styleId="CommentTextChar">
+    <w:name w:val="Comment Text Char"/>
+    <w:basedOn w:val="DefaultParagraphFont"/>
+    <w:link w:val="CommentText"/>
     <w:uiPriority w:val="99"/>
     <w:rsid w:val="00096872"/>
     <w:rPr>
@@ -32046,11 +32044,11 @@
       <w:szCs w:val="20"/>
     </w:rPr>
   </w:style>
-  <w:style w:type="paragraph" w:styleId="Soggettocommento">
+  <w:style w:type="paragraph" w:styleId="CommentSubject">
     <w:name w:val="annotation subject"/>
-    <w:basedOn w:val="Testocommento"/>
-    <w:next w:val="Testocommento"/>
-    <w:link w:val="SoggettocommentoCarattere"/>
+    <w:basedOn w:val="CommentText"/>
+    <w:next w:val="CommentText"/>
+    <w:link w:val="CommentSubjectChar"/>
     <w:uiPriority w:val="99"/>
     <w:semiHidden/>
     <w:unhideWhenUsed/>
@@ -32060,10 +32058,10 @@
       <w:bCs/>
     </w:rPr>
   </w:style>
-  <w:style w:type="character" w:customStyle="1" w:styleId="SoggettocommentoCarattere">
-    <w:name w:val="Soggetto commento Carattere"/>
-    <w:basedOn w:val="TestocommentoCarattere"/>
-    <w:link w:val="Soggettocommento"/>
+  <w:style w:type="character" w:customStyle="1" w:styleId="CommentSubjectChar">
+    <w:name w:val="Comment Subject Char"/>
+    <w:basedOn w:val="CommentTextChar"/>
+    <w:link w:val="CommentSubject"/>
     <w:uiPriority w:val="99"/>
     <w:semiHidden/>
     <w:rsid w:val="00096872"/>
@@ -32074,9 +32072,9 @@
       <w:szCs w:val="20"/>
     </w:rPr>
   </w:style>
-  <w:style w:type="character" w:styleId="Menzione">
+  <w:style w:type="character" w:styleId="Mention">
     <w:name w:val="Mention"/>
-    <w:basedOn w:val="Carpredefinitoparagrafo"/>
+    <w:basedOn w:val="DefaultParagraphFont"/>
     <w:uiPriority w:val="99"/>
     <w:unhideWhenUsed/>
     <w:rsid w:val="00096872"/>

</xml_diff>